<commit_message>
Updated the contribution form
</commit_message>
<xml_diff>
--- a/Assignment3_Group_Contribution_Form-G31.docx
+++ b/Assignment3_Group_Contribution_Form-G31.docx
@@ -12,7 +12,7 @@
         <w:pStyle w:val="BodyA"/>
         <w:jc w:val="center"/>
         <w:rPr>
-          <w:rFonts w:ascii="Calibri" w:hAnsi="Calibri" w:eastAsia="Calibri" w:cs="Calibri"/>
+          <w:rFonts w:ascii="Calibri" w:eastAsia="Calibri" w:hAnsi="Calibri" w:cs="Calibri"/>
           <w:b/>
           <w:bCs/>
           <w:color w:val="365F91"/>
@@ -40,7 +40,7 @@
         <w:pStyle w:val="BodyA"/>
         <w:jc w:val="center"/>
         <w:rPr>
-          <w:rFonts w:ascii="Calibri" w:hAnsi="Calibri" w:eastAsia="Calibri" w:cs="Calibri"/>
+          <w:rFonts w:ascii="Calibri" w:eastAsia="Calibri" w:hAnsi="Calibri" w:cs="Calibri"/>
           <w:b/>
           <w:bCs/>
           <w:color w:val="365F91"/>
@@ -85,7 +85,7 @@
         </w:rPr>
         <w:t xml:space="preserve">         GitHub repository: </w:t>
       </w:r>
-      <w:hyperlink w:history="1" r:id="rId6">
+      <w:hyperlink r:id="rId7" w:history="1">
         <w:r>
           <w:rPr>
             <w:rStyle w:val="Hyperlink0"/>
@@ -174,7 +174,28 @@
           <w:rStyle w:val="None"/>
           <w:lang w:val="en-US"/>
         </w:rPr>
-        <w:t>Name: ____________________________________    Student ID: ____________________</w:t>
+        <w:t xml:space="preserve">Name: </w:t>
+      </w:r>
+      <w:r>
+        <w:rPr>
+          <w:rStyle w:val="None"/>
+          <w:lang w:val="en-US"/>
+        </w:rPr>
+        <w:t>Dilushi Mirthula Rajendran</w:t>
+      </w:r>
+      <w:r>
+        <w:rPr>
+          <w:rStyle w:val="None"/>
+          <w:lang w:val="en-US"/>
+        </w:rPr>
+        <w:t xml:space="preserve">   Student ID:</w:t>
+      </w:r>
+      <w:r>
+        <w:rPr>
+          <w:rStyle w:val="None"/>
+          <w:lang w:val="en-US"/>
+        </w:rPr>
+        <w:t xml:space="preserve"> s4136532</w:t>
       </w:r>
     </w:p>
     <w:p>
@@ -186,8 +207,24 @@
           <w:rStyle w:val="None"/>
           <w:lang w:val="en-US"/>
         </w:rPr>
-        <w:t>GitHub Name: _____________________________</w:t>
-      </w:r>
+        <w:t>GitHub Name:</w:t>
+      </w:r>
+      <w:r>
+        <w:rPr>
+          <w:rStyle w:val="None"/>
+          <w:lang w:val="en-US"/>
+        </w:rPr>
+        <w:t xml:space="preserve"> </w:t>
+      </w:r>
+      <w:proofErr w:type="spellStart"/>
+      <w:r>
+        <w:rPr>
+          <w:rStyle w:val="None"/>
+          <w:lang w:val="en-US"/>
+        </w:rPr>
+        <w:t>DiluMiru</w:t>
+      </w:r>
+      <w:proofErr w:type="spellEnd"/>
     </w:p>
     <w:p>
       <w:pPr>
@@ -208,8 +245,9 @@
       <w:r>
         <w:rPr>
           <w:rStyle w:val="None"/>
-        </w:rPr>
-        <w:t>☐</w:t>
+          <w:lang w:val="de-DE"/>
+        </w:rPr>
+        <w:t>X</w:t>
       </w:r>
       <w:r>
         <w:rPr>
@@ -228,26 +266,433 @@
         <w:rPr>
           <w:rStyle w:val="None"/>
         </w:rPr>
-        <w:t>☐</w:t>
-      </w:r>
-      <w:r>
-        <w:rPr>
-          <w:rStyle w:val="None"/>
-        </w:rPr>
+        <w:t xml:space="preserve">☐ </w:t>
+      </w:r>
+      <w:r>
+        <w:rPr>
+          <w:rStyle w:val="None"/>
+          <w:lang w:val="de-DE"/>
+        </w:rPr>
+        <w:t xml:space="preserve">JMeter analysis   </w:t>
+      </w:r>
+      <w:r>
+        <w:rPr>
+          <w:rStyle w:val="None"/>
+        </w:rPr>
+        <w:t>☐ Selenium tests</w:t>
+      </w:r>
+      <w:r>
+        <w:rPr>
+          <w:rStyle w:val="None"/>
+        </w:rPr>
+        <w:br/>
+        <w:t xml:space="preserve">☐ </w:t>
+      </w:r>
+      <w:r>
+        <w:rPr>
+          <w:rStyle w:val="None"/>
+          <w:lang w:val="de-DE"/>
+        </w:rPr>
+        <w:t xml:space="preserve">SpiraPlan integration   </w:t>
+      </w:r>
+      <w:r>
+        <w:rPr>
+          <w:rStyle w:val="None"/>
+        </w:rPr>
+        <w:t xml:space="preserve">☐ </w:t>
+      </w:r>
+      <w:r>
+        <w:rPr>
+          <w:rStyle w:val="None"/>
+          <w:lang w:val="en-US"/>
+        </w:rPr>
+        <w:t xml:space="preserve">Cucumber tests   </w:t>
+      </w:r>
+      <w:r>
+        <w:rPr>
+          <w:rStyle w:val="None"/>
+        </w:rPr>
+        <w:t xml:space="preserve">☐ </w:t>
+      </w:r>
+      <w:r>
+        <w:rPr>
+          <w:rStyle w:val="None"/>
+          <w:lang w:val="en-US"/>
+        </w:rPr>
+        <w:t>Code review/debugging/integration</w:t>
+      </w:r>
+    </w:p>
+    <w:p>
+      <w:pPr>
+        <w:pStyle w:val="BodyA"/>
+      </w:pPr>
+      <w:r>
+        <w:rPr>
+          <w:rStyle w:val="None"/>
+          <w:lang w:val="en-US"/>
+        </w:rPr>
+        <w:t xml:space="preserve">Specific work completed: </w:t>
+      </w:r>
+      <w:r>
+        <w:t>Created a JMeter test plan with four Thread Groups for 1, 10, 20, and 50 virtual users</w:t>
+      </w:r>
+      <w:r>
+        <w:t xml:space="preserve">, </w:t>
+      </w:r>
+      <w:r>
+        <w:t>Configured a 10-second ramp-up period and a 20-second test duration for each Thread Group</w:t>
+      </w:r>
+      <w:r>
+        <w:t xml:space="preserve">, </w:t>
+      </w:r>
+      <w:r>
+        <w:t xml:space="preserve">Developed the </w:t>
+      </w:r>
+      <w:proofErr w:type="spellStart"/>
+      <w:r>
+        <w:t>ParaBank</w:t>
+      </w:r>
+      <w:proofErr w:type="spellEnd"/>
+      <w:r>
+        <w:t xml:space="preserve"> user journey covering login, accounts overview, viewing account details, transferring funds, viewing transactions, and logout</w:t>
+      </w:r>
+      <w:r>
+        <w:t xml:space="preserve">, </w:t>
+      </w:r>
+      <w:r>
+        <w:t xml:space="preserve">Configured HTTP requests, a Cookie Manager, and a 300 </w:t>
+      </w:r>
+      <w:proofErr w:type="spellStart"/>
+      <w:r>
+        <w:t>ms</w:t>
+      </w:r>
+      <w:proofErr w:type="spellEnd"/>
+      <w:r>
+        <w:t xml:space="preserve"> Constant Timer before the Home Page request</w:t>
+      </w:r>
+      <w:r>
+        <w:t xml:space="preserve">, </w:t>
+      </w:r>
+      <w:r>
+        <w:t>Added response assertions to validate HTTP responses and configured the test to continue when a sampler fails</w:t>
+      </w:r>
+      <w:r>
+        <w:t xml:space="preserve">, </w:t>
+      </w:r>
+      <w:r>
+        <w:t>Executed performance tests and investigated errors, including HTTP 429 (Too Many Requests) and login failures, during concurrent testing.</w:t>
+      </w:r>
+      <w:r>
         <w:t xml:space="preserve"> </w:t>
       </w:r>
+    </w:p>
+    <w:p>
+      <w:pPr>
+        <w:pStyle w:val="Heading2"/>
+      </w:pPr>
+      <w:r>
+        <w:rPr>
+          <w:rStyle w:val="None"/>
+        </w:rPr>
+        <w:t>Student 2</w:t>
+      </w:r>
+    </w:p>
+    <w:p>
+      <w:pPr>
+        <w:pStyle w:val="BodyA"/>
+      </w:pPr>
       <w:r>
         <w:rPr>
           <w:rStyle w:val="None"/>
           <w:lang w:val="de-DE"/>
         </w:rPr>
+        <w:t>Name: Pisethrosanit Sean    Student ID: s4152770</w:t>
+      </w:r>
+    </w:p>
+    <w:p>
+      <w:pPr>
+        <w:pStyle w:val="BodyA"/>
+      </w:pPr>
+      <w:r>
+        <w:rPr>
+          <w:rStyle w:val="None"/>
+          <w:lang w:val="de-DE"/>
+        </w:rPr>
+        <w:t>GitHub Name: s4152770</w:t>
+      </w:r>
+    </w:p>
+    <w:p>
+      <w:pPr>
+        <w:pStyle w:val="BodyA"/>
+      </w:pPr>
+      <w:r>
+        <w:rPr>
+          <w:rStyle w:val="None"/>
+          <w:lang w:val="en-US"/>
+        </w:rPr>
+        <w:t>Contribution areas (tick all that apply):</w:t>
+      </w:r>
+    </w:p>
+    <w:p>
+      <w:pPr>
+        <w:pStyle w:val="BodyA"/>
+      </w:pPr>
+      <w:r>
+        <w:rPr>
+          <w:rStyle w:val="None"/>
+          <w:lang w:val="de-DE"/>
+        </w:rPr>
+        <w:t xml:space="preserve">X  JMeter test plan/execution   X JMeter analysis   </w:t>
+      </w:r>
+      <w:r>
+        <w:rPr>
+          <w:rStyle w:val="None"/>
+        </w:rPr>
+        <w:t>☐ Selenium tests</w:t>
+      </w:r>
+      <w:r>
+        <w:rPr>
+          <w:rStyle w:val="None"/>
+        </w:rPr>
+        <w:br/>
+        <w:t xml:space="preserve">☐ </w:t>
+      </w:r>
+      <w:r>
+        <w:rPr>
+          <w:rStyle w:val="None"/>
+          <w:lang w:val="de-DE"/>
+        </w:rPr>
+        <w:t xml:space="preserve">SpiraPlan integration   </w:t>
+      </w:r>
+      <w:r>
+        <w:rPr>
+          <w:rStyle w:val="None"/>
+        </w:rPr>
+        <w:t xml:space="preserve">☐ </w:t>
+      </w:r>
+      <w:r>
+        <w:rPr>
+          <w:rStyle w:val="None"/>
+          <w:lang w:val="en-US"/>
+        </w:rPr>
+        <w:t>Cucumber tests   X Code review/debugging/integration</w:t>
+      </w:r>
+    </w:p>
+    <w:p>
+      <w:pPr>
+        <w:pStyle w:val="BodyA"/>
+      </w:pPr>
+      <w:r>
+        <w:rPr>
+          <w:rStyle w:val="None"/>
+          <w:lang w:val="en-US"/>
+        </w:rPr>
+        <w:t xml:space="preserve">Specific work completed: Modified the existing JMeter test plan to run different load scenarios, then </w:t>
+      </w:r>
+      <w:proofErr w:type="spellStart"/>
+      <w:r>
+        <w:rPr>
+          <w:rStyle w:val="None"/>
+          <w:lang w:val="en-US"/>
+        </w:rPr>
+        <w:t>analysed</w:t>
+      </w:r>
+      <w:proofErr w:type="spellEnd"/>
+      <w:r>
+        <w:rPr>
+          <w:rStyle w:val="None"/>
+          <w:lang w:val="en-US"/>
+        </w:rPr>
+        <w:t xml:space="preserve"> the results, including response times, throughput and error rates, to identify performance trends. Also helped review my team members</w:t>
+      </w:r>
+      <w:r>
+        <w:rPr>
+          <w:rStyle w:val="None"/>
+          <w:rtl/>
+        </w:rPr>
+        <w:t xml:space="preserve">’ </w:t>
+      </w:r>
+      <w:r>
+        <w:rPr>
+          <w:rStyle w:val="None"/>
+          <w:lang w:val="en-US"/>
+        </w:rPr>
+        <w:t>parts before submission.</w:t>
+      </w:r>
+    </w:p>
+    <w:p>
+      <w:pPr>
+        <w:pStyle w:val="Heading2"/>
+        <w:rPr>
+          <w:lang w:val="de-DE"/>
+        </w:rPr>
+      </w:pPr>
+      <w:r>
+        <w:rPr>
+          <w:rStyle w:val="None"/>
+          <w:lang w:val="de-DE"/>
+        </w:rPr>
+        <w:t>Student 3</w:t>
+      </w:r>
+    </w:p>
+    <w:p>
+      <w:pPr>
+        <w:pStyle w:val="BodyA"/>
+        <w:rPr>
+          <w:rStyle w:val="None"/>
+          <w:lang w:val="en-US"/>
+        </w:rPr>
+      </w:pPr>
+      <w:r>
+        <w:rPr>
+          <w:rStyle w:val="None"/>
+          <w:lang w:val="en-US"/>
+        </w:rPr>
+        <w:t xml:space="preserve">Name: </w:t>
+      </w:r>
+      <w:r>
+        <w:rPr>
+          <w:rStyle w:val="None"/>
+          <w:lang w:val="en-US"/>
+        </w:rPr>
+        <w:t xml:space="preserve"> Erangika Roshni </w:t>
+      </w:r>
+      <w:r>
+        <w:rPr>
+          <w:rStyle w:val="None"/>
+          <w:lang w:val="en-US"/>
+        </w:rPr>
+        <w:t xml:space="preserve">Chandrasekaran </w:t>
+      </w:r>
+      <w:proofErr w:type="gramStart"/>
+      <w:r>
+        <w:rPr>
+          <w:rStyle w:val="None"/>
+          <w:lang w:val="en-US"/>
+        </w:rPr>
+        <w:t>Student</w:t>
+      </w:r>
+      <w:r>
+        <w:rPr>
+          <w:rStyle w:val="None"/>
+          <w:lang w:val="en-US"/>
+        </w:rPr>
+        <w:t xml:space="preserve"> </w:t>
+      </w:r>
+      <w:r>
+        <w:rPr>
+          <w:rStyle w:val="None"/>
+          <w:lang w:val="en-US"/>
+        </w:rPr>
+        <w:t xml:space="preserve"> </w:t>
+      </w:r>
+      <w:r>
+        <w:rPr>
+          <w:rStyle w:val="None"/>
+          <w:lang w:val="en-US"/>
+        </w:rPr>
+        <w:t>ID</w:t>
+      </w:r>
+      <w:proofErr w:type="gramEnd"/>
+      <w:r>
+        <w:rPr>
+          <w:rStyle w:val="None"/>
+          <w:lang w:val="en-US"/>
+        </w:rPr>
+        <w:t xml:space="preserve">: </w:t>
+      </w:r>
+      <w:r>
+        <w:rPr>
+          <w:rStyle w:val="None"/>
+          <w:lang w:val="en-US"/>
+        </w:rPr>
+        <w:t>s4142412</w:t>
+      </w:r>
+    </w:p>
+    <w:p>
+      <w:pPr>
+        <w:pStyle w:val="BodyA"/>
+      </w:pPr>
+      <w:r>
+        <w:rPr>
+          <w:rStyle w:val="None"/>
+          <w:lang w:val="en-US"/>
+        </w:rPr>
+        <w:lastRenderedPageBreak/>
+        <w:t>GitHub Name</w:t>
+      </w:r>
+      <w:proofErr w:type="gramStart"/>
+      <w:r>
+        <w:rPr>
+          <w:rStyle w:val="None"/>
+          <w:lang w:val="en-US"/>
+        </w:rPr>
+        <w:t xml:space="preserve">: </w:t>
+      </w:r>
+      <w:r>
+        <w:rPr>
+          <w:rStyle w:val="None"/>
+          <w:lang w:val="en-US"/>
+        </w:rPr>
+        <w:t xml:space="preserve"> erangikaroshni</w:t>
+      </w:r>
+      <w:proofErr w:type="gramEnd"/>
+      <w:r>
+        <w:rPr>
+          <w:rStyle w:val="None"/>
+          <w:lang w:val="en-US"/>
+        </w:rPr>
+        <w:t>-23</w:t>
+      </w:r>
+    </w:p>
+    <w:p>
+      <w:pPr>
+        <w:pStyle w:val="BodyA"/>
+      </w:pPr>
+      <w:r>
+        <w:rPr>
+          <w:rStyle w:val="None"/>
+          <w:lang w:val="en-US"/>
+        </w:rPr>
+        <w:t>Contribution areas (tick all that apply):</w:t>
+      </w:r>
+    </w:p>
+    <w:p>
+      <w:pPr>
+        <w:pStyle w:val="BodyA"/>
+      </w:pPr>
+      <w:r>
+        <w:rPr>
+          <w:rStyle w:val="None"/>
+        </w:rPr>
+        <w:t xml:space="preserve">☐ </w:t>
+      </w:r>
+      <w:r>
+        <w:rPr>
+          <w:rStyle w:val="None"/>
+          <w:lang w:val="de-DE"/>
+        </w:rPr>
+        <w:t xml:space="preserve">JMeter test plan/execution   </w:t>
+      </w:r>
+      <w:r>
+        <w:rPr>
+          <w:rStyle w:val="None"/>
+        </w:rPr>
+        <w:t xml:space="preserve">☐ </w:t>
+      </w:r>
+      <w:r>
+        <w:rPr>
+          <w:rStyle w:val="None"/>
+          <w:lang w:val="de-DE"/>
+        </w:rPr>
         <w:t xml:space="preserve">JMeter analysis   </w:t>
       </w:r>
       <w:r>
         <w:rPr>
           <w:rStyle w:val="None"/>
-        </w:rPr>
-        <w:t>☐</w:t>
+          <w:lang w:val="de-DE"/>
+        </w:rPr>
+        <w:t>X</w:t>
       </w:r>
       <w:r>
         <w:rPr>
@@ -256,33 +701,407 @@
         <w:t xml:space="preserve"> Selenium tests</w:t>
       </w:r>
       <w:r>
-        <w:rPr>
-          <w:rStyle w:val="None"/>
-        </w:rPr>
         <w:br/>
       </w:r>
       <w:r>
         <w:rPr>
           <w:rStyle w:val="None"/>
         </w:rPr>
+        <w:t>X</w:t>
+      </w:r>
+      <w:r>
+        <w:rPr>
+          <w:rStyle w:val="None"/>
+        </w:rPr>
+        <w:t xml:space="preserve"> </w:t>
+      </w:r>
+      <w:r>
+        <w:rPr>
+          <w:rStyle w:val="None"/>
+          <w:lang w:val="de-DE"/>
+        </w:rPr>
+        <w:t xml:space="preserve">SpiraPlan integration   </w:t>
+      </w:r>
+      <w:r>
+        <w:rPr>
+          <w:rStyle w:val="None"/>
+        </w:rPr>
         <w:t xml:space="preserve">☐ </w:t>
       </w:r>
       <w:r>
         <w:rPr>
           <w:rStyle w:val="None"/>
+          <w:lang w:val="en-US"/>
+        </w:rPr>
+        <w:t xml:space="preserve">Cucumber tests   </w:t>
+      </w:r>
+      <w:r>
+        <w:rPr>
+          <w:rStyle w:val="None"/>
+          <w:lang w:val="en-US"/>
+        </w:rPr>
+        <w:t xml:space="preserve">X </w:t>
+      </w:r>
+      <w:r>
+        <w:rPr>
+          <w:rStyle w:val="None"/>
+          <w:lang w:val="en-US"/>
+        </w:rPr>
+        <w:t>Code review/debugging/integration</w:t>
+      </w:r>
+    </w:p>
+    <w:p>
+      <w:pPr>
+        <w:pStyle w:val="BodyA"/>
+        <w:rPr>
+          <w:rStyle w:val="None"/>
+          <w:lang w:val="en-US"/>
+        </w:rPr>
+      </w:pPr>
+      <w:r>
+        <w:rPr>
+          <w:rStyle w:val="None"/>
+          <w:lang w:val="en-US"/>
+        </w:rPr>
+        <w:t xml:space="preserve">Specific work completed: </w:t>
+      </w:r>
+      <w:r>
+        <w:rPr>
+          <w:rStyle w:val="None"/>
+          <w:lang w:val="en-US"/>
+        </w:rPr>
+        <w:t>Tested the User Registration and User Login features of ParaBank. Two requirements and twenty test cases</w:t>
+      </w:r>
+      <w:r>
+        <w:rPr>
+          <w:rStyle w:val="None"/>
+          <w:lang w:val="en-US"/>
+        </w:rPr>
+        <w:t xml:space="preserve"> were created</w:t>
+      </w:r>
+      <w:r>
+        <w:rPr>
+          <w:rStyle w:val="None"/>
+          <w:lang w:val="en-US"/>
+        </w:rPr>
+        <w:t>: 8 for registration and 12 for login, cover</w:t>
+      </w:r>
+      <w:r>
+        <w:rPr>
+          <w:rStyle w:val="None"/>
+          <w:lang w:val="en-US"/>
+        </w:rPr>
+        <w:t xml:space="preserve">ing </w:t>
+      </w:r>
+      <w:r>
+        <w:rPr>
+          <w:rStyle w:val="None"/>
+          <w:lang w:val="en-US"/>
+        </w:rPr>
+        <w:t>positive, negative</w:t>
+      </w:r>
+      <w:r>
+        <w:rPr>
+          <w:rStyle w:val="None"/>
+          <w:lang w:val="en-US"/>
+        </w:rPr>
+        <w:t>,</w:t>
+      </w:r>
+      <w:r>
+        <w:rPr>
+          <w:rStyle w:val="None"/>
+          <w:lang w:val="en-US"/>
+        </w:rPr>
+        <w:t xml:space="preserve"> and boundary scenarios. </w:t>
+      </w:r>
+      <w:r>
+        <w:rPr>
+          <w:lang w:val="en-US"/>
+        </w:rPr>
+        <w:t>The test cases were grouped into test sets for each feature.</w:t>
+      </w:r>
+      <w:r>
+        <w:rPr>
+          <w:lang w:val="en-US"/>
+        </w:rPr>
+        <w:t xml:space="preserve"> </w:t>
+      </w:r>
+      <w:r>
+        <w:rPr>
+          <w:rStyle w:val="None"/>
+          <w:lang w:val="en-US"/>
+        </w:rPr>
+        <w:t xml:space="preserve">The tests were automated in Java with Selenium </w:t>
+      </w:r>
+      <w:r>
+        <w:rPr>
+          <w:rStyle w:val="None"/>
+          <w:lang w:val="en-US"/>
+        </w:rPr>
+        <w:t xml:space="preserve">and linked to SpiraPlan, where </w:t>
+      </w:r>
+      <w:r>
+        <w:rPr>
+          <w:rStyle w:val="None"/>
+          <w:lang w:val="en-US"/>
+        </w:rPr>
+        <w:t xml:space="preserve">the </w:t>
+      </w:r>
+      <w:r>
+        <w:rPr>
+          <w:rStyle w:val="None"/>
+          <w:lang w:val="en-US"/>
+        </w:rPr>
+        <w:t xml:space="preserve">results </w:t>
+      </w:r>
+      <w:r>
+        <w:rPr>
+          <w:rStyle w:val="None"/>
+          <w:lang w:val="en-US"/>
+        </w:rPr>
+        <w:t>we</w:t>
+      </w:r>
+      <w:r>
+        <w:rPr>
+          <w:rStyle w:val="None"/>
+          <w:lang w:val="en-US"/>
+        </w:rPr>
+        <w:t xml:space="preserve">re recorded automatically, and all twenty tests </w:t>
+      </w:r>
+      <w:r>
+        <w:rPr>
+          <w:rStyle w:val="None"/>
+          <w:lang w:val="en-US"/>
+        </w:rPr>
+        <w:t>passed</w:t>
+      </w:r>
+      <w:r>
+        <w:rPr>
+          <w:rStyle w:val="None"/>
+          <w:lang w:val="en-US"/>
+        </w:rPr>
+        <w:t>.</w:t>
+      </w:r>
+    </w:p>
+    <w:p>
+      <w:pPr>
+        <w:pStyle w:val="Heading2"/>
+        <w:rPr>
           <w:lang w:val="de-DE"/>
         </w:rPr>
+      </w:pPr>
+      <w:r>
+        <w:rPr>
+          <w:rStyle w:val="None"/>
+          <w:lang w:val="de-DE"/>
+        </w:rPr>
+        <w:t>Student 4</w:t>
+      </w:r>
+    </w:p>
+    <w:p>
+      <w:pPr>
+        <w:pStyle w:val="BodyA"/>
+      </w:pPr>
+      <w:r>
+        <w:rPr>
+          <w:rStyle w:val="None"/>
+          <w:lang w:val="de-DE"/>
+        </w:rPr>
+        <w:t xml:space="preserve">Name: </w:t>
+      </w:r>
+      <w:r>
+        <w:rPr>
+          <w:rStyle w:val="None"/>
+          <w:lang w:val="en-US"/>
+        </w:rPr>
+        <w:t>Kavya Thampan</w:t>
+      </w:r>
+      <w:r>
+        <w:rPr>
+          <w:rStyle w:val="None"/>
+          <w:lang w:val="de-DE"/>
+        </w:rPr>
+        <w:t xml:space="preserve">    Student ID: </w:t>
+      </w:r>
+      <w:r>
+        <w:rPr>
+          <w:rStyle w:val="None"/>
+          <w:lang w:val="en-US"/>
+        </w:rPr>
+        <w:t>s4139615</w:t>
+      </w:r>
+    </w:p>
+    <w:p>
+      <w:pPr>
+        <w:pStyle w:val="BodyA"/>
+      </w:pPr>
+      <w:r>
+        <w:rPr>
+          <w:rStyle w:val="None"/>
+          <w:lang w:val="de-DE"/>
+        </w:rPr>
+        <w:t xml:space="preserve">GitHub Name: </w:t>
+      </w:r>
+      <w:r>
+        <w:rPr>
+          <w:rStyle w:val="None"/>
+          <w:lang w:val="en-US"/>
+        </w:rPr>
+        <w:t>Kavs2k</w:t>
+      </w:r>
+    </w:p>
+    <w:p>
+      <w:pPr>
+        <w:pStyle w:val="BodyA"/>
+      </w:pPr>
+      <w:r>
+        <w:rPr>
+          <w:rStyle w:val="None"/>
+          <w:lang w:val="en-US"/>
+        </w:rPr>
+        <w:t>Contribution areas (tick all that apply):</w:t>
+      </w:r>
+    </w:p>
+    <w:p>
+      <w:pPr>
+        <w:pStyle w:val="BodyA"/>
+      </w:pPr>
+      <w:r>
+        <w:rPr>
+          <w:rStyle w:val="None"/>
+        </w:rPr>
+        <w:t xml:space="preserve">☐ </w:t>
+      </w:r>
+      <w:r>
+        <w:rPr>
+          <w:rStyle w:val="None"/>
+          <w:lang w:val="de-DE"/>
+        </w:rPr>
+        <w:t xml:space="preserve">JMeter test plan/execution   </w:t>
+      </w:r>
+      <w:r>
+        <w:rPr>
+          <w:rStyle w:val="None"/>
+        </w:rPr>
+        <w:t xml:space="preserve">☐ </w:t>
+      </w:r>
+      <w:r>
+        <w:rPr>
+          <w:rStyle w:val="None"/>
+          <w:lang w:val="de-DE"/>
+        </w:rPr>
+        <w:t xml:space="preserve">JMeter analysis   </w:t>
+      </w:r>
+      <w:r>
+        <w:rPr>
+          <w:rStyle w:val="None"/>
+          <w:lang w:val="en-US"/>
+        </w:rPr>
+        <w:t>X</w:t>
+      </w:r>
+      <w:r>
+        <w:rPr>
+          <w:rStyle w:val="None"/>
+        </w:rPr>
+        <w:t xml:space="preserve"> Selenium tests</w:t>
+      </w:r>
+      <w:r>
+        <w:rPr>
+          <w:rStyle w:val="None"/>
+        </w:rPr>
+        <w:br/>
+      </w:r>
+      <w:r>
+        <w:rPr>
+          <w:rStyle w:val="None"/>
+          <w:lang w:val="en-US"/>
+        </w:rPr>
+        <w:t xml:space="preserve">X </w:t>
+      </w:r>
+      <w:r>
+        <w:rPr>
+          <w:rStyle w:val="None"/>
+          <w:lang w:val="de-DE"/>
+        </w:rPr>
         <w:t xml:space="preserve">SpiraPlan integration   </w:t>
       </w:r>
       <w:r>
         <w:rPr>
           <w:rStyle w:val="None"/>
         </w:rPr>
-        <w:t>☐</w:t>
-      </w:r>
-      <w:r>
-        <w:rPr>
-          <w:rStyle w:val="None"/>
+        <w:t xml:space="preserve">☐ </w:t>
+      </w:r>
+      <w:r>
+        <w:rPr>
+          <w:rStyle w:val="None"/>
+          <w:lang w:val="en-US"/>
+        </w:rPr>
+        <w:t>Cucumber tests   X Code review/debugging/integration</w:t>
+      </w:r>
+    </w:p>
+    <w:p>
+      <w:pPr>
+        <w:pStyle w:val="BodyA"/>
+      </w:pPr>
+      <w:r>
+        <w:rPr>
+          <w:rStyle w:val="None"/>
+          <w:lang w:val="en-US"/>
+        </w:rPr>
+        <w:t>Specific work completed: Worked on the Selenium project and Spira integration setup, 16 automated tests for Open New Account and Bill Pay with Spira test cases, test sets and logged incidents, and the Selenium video presentation.</w:t>
+      </w:r>
+    </w:p>
+    <w:p>
+      <w:pPr>
+        <w:pStyle w:val="Heading2"/>
+        <w:rPr>
+          <w:lang w:val="de-DE"/>
+        </w:rPr>
+      </w:pPr>
+      <w:r>
+        <w:rPr>
+          <w:rStyle w:val="None"/>
+          <w:lang w:val="de-DE"/>
+        </w:rPr>
+        <w:t>Student 5</w:t>
+      </w:r>
+    </w:p>
+    <w:p>
+      <w:pPr>
+        <w:pStyle w:val="BodyA"/>
+      </w:pPr>
+      <w:r>
+        <w:rPr>
+          <w:rStyle w:val="None"/>
+          <w:lang w:val="en-US"/>
+        </w:rPr>
+        <w:t xml:space="preserve">Name: </w:t>
+      </w:r>
+      <w:r>
+        <w:rPr>
+          <w:rStyle w:val="None"/>
+          <w:lang w:val="en-US"/>
+        </w:rPr>
+        <w:t>Thashi Maleesa Godahewa</w:t>
+      </w:r>
+      <w:r>
+        <w:rPr>
+          <w:rStyle w:val="None"/>
+          <w:lang w:val="en-US"/>
+        </w:rPr>
+        <w:t xml:space="preserve">          </w:t>
+      </w:r>
+      <w:r>
+        <w:rPr>
+          <w:rStyle w:val="None"/>
+          <w:lang w:val="en-US"/>
+        </w:rPr>
+        <w:t xml:space="preserve">  Student ID:</w:t>
+      </w:r>
+      <w:r>
+        <w:rPr>
+          <w:rStyle w:val="None"/>
+          <w:lang w:val="en-US"/>
         </w:rPr>
         <w:t xml:space="preserve"> </w:t>
       </w:r>
@@ -291,26 +1110,14 @@
           <w:rStyle w:val="None"/>
           <w:lang w:val="en-US"/>
         </w:rPr>
-        <w:t xml:space="preserve">Cucumber tests   </w:t>
-      </w:r>
-      <w:r>
-        <w:rPr>
-          <w:rStyle w:val="None"/>
-        </w:rPr>
-        <w:t>☐</w:t>
-      </w:r>
-      <w:r>
-        <w:rPr>
-          <w:rStyle w:val="None"/>
-        </w:rPr>
-        <w:t xml:space="preserve"> </w:t>
-      </w:r>
-      <w:r>
-        <w:rPr>
-          <w:rStyle w:val="None"/>
-          <w:lang w:val="en-US"/>
-        </w:rPr>
-        <w:t>Code review/debugging/integration</w:t>
+        <w:t>s</w:t>
+      </w:r>
+      <w:r>
+        <w:rPr>
+          <w:rStyle w:val="None"/>
+          <w:lang w:val="en-US"/>
+        </w:rPr>
+        <w:t>4143272</w:t>
       </w:r>
     </w:p>
     <w:p>
@@ -322,860 +1129,9 @@
           <w:rStyle w:val="None"/>
           <w:lang w:val="en-US"/>
         </w:rPr>
-        <w:t>Specific work completed: ______________________________________________________________</w:t>
-      </w:r>
-      <w:r>
-        <w:rPr>
-          <w:rStyle w:val="None"/>
-        </w:rPr>
-        <w:br/>
-      </w:r>
-      <w:r>
-        <w:rPr>
-          <w:rStyle w:val="None"/>
-          <w:lang w:val="en-US"/>
-        </w:rPr>
-        <w:t>_____________________________________________________________________________________</w:t>
-      </w:r>
-      <w:r>
-        <w:rPr>
-          <w:rStyle w:val="None"/>
-        </w:rPr>
-        <w:br/>
-      </w:r>
-      <w:r>
-        <w:rPr>
-          <w:rStyle w:val="None"/>
-          <w:lang w:val="en-US"/>
-        </w:rPr>
-        <w:t>_____________________________________________________________________________________</w:t>
-      </w:r>
-    </w:p>
-    <w:p>
-      <w:pPr>
-        <w:pStyle w:val="Heading2"/>
-      </w:pPr>
-      <w:r>
-        <w:rPr>
-          <w:rStyle w:val="None"/>
-        </w:rPr>
-        <w:t>Student 2</w:t>
-      </w:r>
-    </w:p>
-    <w:p>
-      <w:pPr>
-        <w:pStyle w:val="BodyA"/>
-      </w:pPr>
-      <w:r>
-        <w:rPr>
-          <w:rStyle w:val="None"/>
-          <w:lang w:val="de-DE"/>
-        </w:rPr>
-        <w:t>Name: Pisethrosanit Sean    Student ID: s4152770</w:t>
-      </w:r>
-    </w:p>
-    <w:p>
-      <w:pPr>
-        <w:pStyle w:val="BodyA"/>
-      </w:pPr>
-      <w:r>
-        <w:rPr>
-          <w:rStyle w:val="None"/>
-          <w:lang w:val="de-DE"/>
-        </w:rPr>
-        <w:t>GitHub Name: s4152770</w:t>
-      </w:r>
-    </w:p>
-    <w:p>
-      <w:pPr>
-        <w:pStyle w:val="BodyA"/>
-      </w:pPr>
-      <w:r>
-        <w:rPr>
-          <w:rStyle w:val="None"/>
-          <w:lang w:val="en-US"/>
-        </w:rPr>
-        <w:t>Contribution areas (tick all that apply):</w:t>
-      </w:r>
-    </w:p>
-    <w:p>
-      <w:pPr>
-        <w:pStyle w:val="BodyA"/>
-      </w:pPr>
-      <w:r>
-        <w:rPr>
-          <w:rStyle w:val="None"/>
-          <w:lang w:val="de-DE"/>
-        </w:rPr>
-        <w:t xml:space="preserve">X  JMeter test plan/execution   X JMeter analysis   </w:t>
-      </w:r>
-      <w:r>
-        <w:rPr>
-          <w:rStyle w:val="None"/>
-        </w:rPr>
-        <w:t>☐ Selenium tests</w:t>
-      </w:r>
-      <w:r>
-        <w:rPr>
-          <w:rStyle w:val="None"/>
-        </w:rPr>
-        <w:br/>
-      </w:r>
-      <w:r>
-        <w:rPr>
-          <w:rStyle w:val="None"/>
-        </w:rPr>
-        <w:t xml:space="preserve">☐ </w:t>
-      </w:r>
-      <w:r>
-        <w:rPr>
-          <w:rStyle w:val="None"/>
-          <w:lang w:val="de-DE"/>
-        </w:rPr>
-        <w:t xml:space="preserve">SpiraPlan integration   </w:t>
-      </w:r>
-      <w:r>
-        <w:rPr>
-          <w:rStyle w:val="None"/>
-        </w:rPr>
-        <w:t xml:space="preserve">☐ </w:t>
-      </w:r>
-      <w:r>
-        <w:rPr>
-          <w:rStyle w:val="None"/>
-          <w:lang w:val="en-US"/>
-        </w:rPr>
-        <w:t>Cucumber tests   X Code review/debugging/integration</w:t>
-      </w:r>
-    </w:p>
-    <w:p>
-      <w:pPr>
-        <w:pStyle w:val="BodyA"/>
-      </w:pPr>
-      <w:r>
-        <w:rPr>
-          <w:rStyle w:val="None"/>
-          <w:lang w:val="en-US"/>
-        </w:rPr>
-        <w:t xml:space="preserve">Specific work completed: Modified the existing JMeter test plan to run different load scenarios, then </w:t>
-      </w:r>
-      <w:proofErr w:type="spellStart"/>
-      <w:r>
-        <w:rPr>
-          <w:rStyle w:val="None"/>
-          <w:lang w:val="en-US"/>
-        </w:rPr>
-        <w:t>analysed</w:t>
-      </w:r>
-      <w:proofErr w:type="spellEnd"/>
-      <w:r>
-        <w:rPr>
-          <w:rStyle w:val="None"/>
-          <w:lang w:val="en-US"/>
-        </w:rPr>
-        <w:t xml:space="preserve"> the results, including response times, throughput and error rates, to identify performance trends. Also helped review my team members</w:t>
-      </w:r>
-      <w:r>
-        <w:rPr>
-          <w:rStyle w:val="None"/>
-          <w:rtl/>
-        </w:rPr>
-        <w:t xml:space="preserve">’ </w:t>
-      </w:r>
-      <w:r>
-        <w:rPr>
-          <w:rStyle w:val="None"/>
-          <w:lang w:val="en-US"/>
-        </w:rPr>
-        <w:t>parts before submission.</w:t>
-      </w:r>
-    </w:p>
-    <w:p>
-      <w:pPr>
-        <w:pStyle w:val="Heading2"/>
-        <w:rPr>
-          <w:lang w:val="de-DE"/>
-        </w:rPr>
-      </w:pPr>
-      <w:r>
-        <w:rPr>
-          <w:rStyle w:val="None"/>
-          <w:lang w:val="de-DE"/>
-        </w:rPr>
-        <w:t>Student 3</w:t>
-      </w:r>
-    </w:p>
-    <w:p>
-      <w:pPr>
-        <w:pStyle w:val="BodyA"/>
-        <w:rPr>
-          <w:rStyle w:val="None"/>
-          <w:lang w:val="en-US"/>
-        </w:rPr>
-      </w:pPr>
-      <w:r>
-        <w:rPr>
-          <w:rStyle w:val="None"/>
-          <w:lang w:val="en-US"/>
-        </w:rPr>
-        <w:t xml:space="preserve">Name: </w:t>
-      </w:r>
-      <w:r>
-        <w:rPr>
-          <w:rStyle w:val="None"/>
-          <w:lang w:val="en-US"/>
-        </w:rPr>
-        <w:t xml:space="preserve"> Erangika Roshni </w:t>
-      </w:r>
-      <w:r>
-        <w:rPr>
-          <w:rStyle w:val="None"/>
-          <w:lang w:val="en-US"/>
-        </w:rPr>
-        <w:t>Chandrasekaran Student</w:t>
-      </w:r>
-      <w:r>
-        <w:rPr>
-          <w:rStyle w:val="None"/>
-          <w:lang w:val="en-US"/>
-        </w:rPr>
-        <w:t xml:space="preserve"> </w:t>
-      </w:r>
-      <w:r>
-        <w:rPr>
-          <w:rStyle w:val="None"/>
-          <w:lang w:val="en-US"/>
-        </w:rPr>
-        <w:t xml:space="preserve"> </w:t>
-      </w:r>
-      <w:r>
-        <w:rPr>
-          <w:rStyle w:val="None"/>
-          <w:lang w:val="en-US"/>
-        </w:rPr>
-        <w:t xml:space="preserve">ID: </w:t>
-      </w:r>
-      <w:r>
-        <w:rPr>
-          <w:rStyle w:val="None"/>
-          <w:lang w:val="en-US"/>
-        </w:rPr>
-        <w:t>s4142412</w:t>
-      </w:r>
-    </w:p>
-    <w:p>
-      <w:pPr>
-        <w:pStyle w:val="BodyA"/>
-      </w:pPr>
-      <w:r>
-        <w:rPr>
-          <w:rStyle w:val="None"/>
-          <w:lang w:val="en-US"/>
-        </w:rPr>
         <w:t xml:space="preserve">GitHub Name: </w:t>
       </w:r>
-      <w:r>
-        <w:rPr>
-          <w:rStyle w:val="None"/>
-          <w:lang w:val="en-US"/>
-        </w:rPr>
-        <w:t xml:space="preserve"> erangikaroshni-23</w:t>
-      </w:r>
-    </w:p>
-    <w:p>
-      <w:pPr>
-        <w:pStyle w:val="BodyA"/>
-      </w:pPr>
-      <w:r>
-        <w:rPr>
-          <w:rStyle w:val="None"/>
-          <w:lang w:val="en-US"/>
-        </w:rPr>
-        <w:t>Contribution areas (tick all that apply):</w:t>
-      </w:r>
-    </w:p>
-    <w:p>
-      <w:pPr>
-        <w:pStyle w:val="BodyA"/>
-      </w:pPr>
-      <w:r>
-        <w:rPr>
-          <w:rStyle w:val="None"/>
-        </w:rPr>
-        <w:t xml:space="preserve">☐ </w:t>
-      </w:r>
-      <w:r>
-        <w:rPr>
-          <w:rStyle w:val="None"/>
-          <w:lang w:val="de-DE"/>
-        </w:rPr>
-        <w:t>JMeter</w:t>
-      </w:r>
-      <w:r>
-        <w:rPr>
-          <w:rStyle w:val="None"/>
-          <w:lang w:val="de-DE"/>
-        </w:rPr>
-        <w:t xml:space="preserve"> </w:t>
-      </w:r>
-      <w:r>
-        <w:rPr>
-          <w:rStyle w:val="None"/>
-          <w:lang w:val="de-DE"/>
-        </w:rPr>
-        <w:t>test</w:t>
-      </w:r>
-      <w:r>
-        <w:rPr>
-          <w:rStyle w:val="None"/>
-          <w:lang w:val="de-DE"/>
-        </w:rPr>
-        <w:t xml:space="preserve"> plan/</w:t>
-      </w:r>
-      <w:r>
-        <w:rPr>
-          <w:rStyle w:val="None"/>
-          <w:lang w:val="de-DE"/>
-        </w:rPr>
-        <w:t>execution</w:t>
-      </w:r>
-      <w:r>
-        <w:rPr>
-          <w:rStyle w:val="None"/>
-          <w:lang w:val="de-DE"/>
-        </w:rPr>
-        <w:t xml:space="preserve">   </w:t>
-      </w:r>
-      <w:r>
-        <w:rPr>
-          <w:rStyle w:val="None"/>
-        </w:rPr>
-        <w:t xml:space="preserve">☐ </w:t>
-      </w:r>
-      <w:r>
-        <w:rPr>
-          <w:rStyle w:val="None"/>
-          <w:lang w:val="de-DE"/>
-        </w:rPr>
-        <w:t>JMeter</w:t>
-      </w:r>
-      <w:r>
-        <w:rPr>
-          <w:rStyle w:val="None"/>
-          <w:lang w:val="de-DE"/>
-        </w:rPr>
-        <w:t xml:space="preserve"> </w:t>
-      </w:r>
-      <w:r>
-        <w:rPr>
-          <w:rStyle w:val="None"/>
-          <w:lang w:val="de-DE"/>
-        </w:rPr>
-        <w:t>analysis</w:t>
-      </w:r>
-      <w:r>
-        <w:rPr>
-          <w:rStyle w:val="None"/>
-          <w:lang w:val="de-DE"/>
-        </w:rPr>
-        <w:t xml:space="preserve">   </w:t>
-      </w:r>
-      <w:r>
-        <w:rPr>
-          <w:rStyle w:val="None"/>
-          <w:lang w:val="de-DE"/>
-        </w:rPr>
-        <w:t>X</w:t>
-      </w:r>
-      <w:r>
-        <w:rPr>
-          <w:rStyle w:val="None"/>
-        </w:rPr>
-        <w:t xml:space="preserve"> Selenium tests</w:t>
-      </w:r>
-      <w:r>
-        <w:br/>
-      </w:r>
-      <w:r>
-        <w:rPr>
-          <w:rStyle w:val="None"/>
-        </w:rPr>
-        <w:t>X</w:t>
-      </w:r>
-      <w:r>
-        <w:rPr>
-          <w:rStyle w:val="None"/>
-        </w:rPr>
-        <w:t xml:space="preserve"> </w:t>
-      </w:r>
-      <w:r>
-        <w:rPr>
-          <w:rStyle w:val="None"/>
-          <w:lang w:val="de-DE"/>
-        </w:rPr>
-        <w:t>SpiraPlan</w:t>
-      </w:r>
-      <w:r>
-        <w:rPr>
-          <w:rStyle w:val="None"/>
-          <w:lang w:val="de-DE"/>
-        </w:rPr>
-        <w:t xml:space="preserve"> </w:t>
-      </w:r>
-      <w:r>
-        <w:rPr>
-          <w:rStyle w:val="None"/>
-          <w:lang w:val="de-DE"/>
-        </w:rPr>
-        <w:t>integration</w:t>
-      </w:r>
-      <w:r>
-        <w:rPr>
-          <w:rStyle w:val="None"/>
-          <w:lang w:val="de-DE"/>
-        </w:rPr>
-        <w:t xml:space="preserve">   </w:t>
-      </w:r>
-      <w:r>
-        <w:rPr>
-          <w:rStyle w:val="None"/>
-        </w:rPr>
-        <w:t xml:space="preserve">☐ </w:t>
-      </w:r>
-      <w:r>
-        <w:rPr>
-          <w:rStyle w:val="None"/>
-          <w:lang w:val="en-US"/>
-        </w:rPr>
-        <w:t xml:space="preserve">Cucumber tests   </w:t>
-      </w:r>
-      <w:r>
-        <w:rPr>
-          <w:rStyle w:val="None"/>
-          <w:lang w:val="en-US"/>
-        </w:rPr>
-        <w:t xml:space="preserve">X </w:t>
-      </w:r>
-      <w:r>
-        <w:rPr>
-          <w:rStyle w:val="None"/>
-          <w:lang w:val="en-US"/>
-        </w:rPr>
-        <w:t>Code review/debugging/integration</w:t>
-      </w:r>
-    </w:p>
-    <w:p>
-      <w:pPr>
-        <w:pStyle w:val="BodyA"/>
-        <w:rPr>
-          <w:rStyle w:val="None"/>
-          <w:lang w:val="en-US"/>
-        </w:rPr>
-      </w:pPr>
-      <w:r>
-        <w:rPr>
-          <w:rStyle w:val="None"/>
-          <w:lang w:val="en-US"/>
-        </w:rPr>
-        <w:t xml:space="preserve">Specific work completed: </w:t>
-      </w:r>
-      <w:r>
-        <w:rPr>
-          <w:rStyle w:val="None"/>
-          <w:lang w:val="en-US"/>
-        </w:rPr>
-        <w:t xml:space="preserve">Tested the User Registration and User Login features of </w:t>
-      </w:r>
-      <w:r>
-        <w:rPr>
-          <w:rStyle w:val="None"/>
-          <w:lang w:val="en-US"/>
-        </w:rPr>
-        <w:t>ParaBank</w:t>
-      </w:r>
-      <w:r>
-        <w:rPr>
-          <w:rStyle w:val="None"/>
-          <w:lang w:val="en-US"/>
-        </w:rPr>
-        <w:t>. Two requirements and twenty test cases</w:t>
-      </w:r>
-      <w:r>
-        <w:rPr>
-          <w:rStyle w:val="None"/>
-          <w:lang w:val="en-US"/>
-        </w:rPr>
-        <w:t xml:space="preserve"> were created</w:t>
-      </w:r>
-      <w:r>
-        <w:rPr>
-          <w:rStyle w:val="None"/>
-          <w:lang w:val="en-US"/>
-        </w:rPr>
-        <w:t>: 8 for registration and 12 for login, cover</w:t>
-      </w:r>
-      <w:r>
-        <w:rPr>
-          <w:rStyle w:val="None"/>
-          <w:lang w:val="en-US"/>
-        </w:rPr>
-        <w:t xml:space="preserve">ing </w:t>
-      </w:r>
-      <w:r>
-        <w:rPr>
-          <w:rStyle w:val="None"/>
-          <w:lang w:val="en-US"/>
-        </w:rPr>
-        <w:t>positive, negative</w:t>
-      </w:r>
-      <w:r>
-        <w:rPr>
-          <w:rStyle w:val="None"/>
-          <w:lang w:val="en-US"/>
-        </w:rPr>
-        <w:t>,</w:t>
-      </w:r>
-      <w:r>
-        <w:rPr>
-          <w:rStyle w:val="None"/>
-          <w:lang w:val="en-US"/>
-        </w:rPr>
-        <w:t xml:space="preserve"> and boundary scenarios. </w:t>
-      </w:r>
-      <w:r>
-        <w:rPr>
-          <w:noProof w:val="0"/>
-          <w:lang w:val="en-US"/>
-        </w:rPr>
-        <w:t>The test cases were grouped into test sets for each feature.</w:t>
-      </w:r>
-      <w:r>
-        <w:rPr>
-          <w:noProof w:val="0"/>
-          <w:lang w:val="en-US"/>
-        </w:rPr>
-        <w:t xml:space="preserve"> </w:t>
-      </w:r>
-      <w:r>
-        <w:rPr>
-          <w:rStyle w:val="None"/>
-          <w:lang w:val="en-US"/>
-        </w:rPr>
-        <w:t xml:space="preserve">The tests were automated in Java with Selenium </w:t>
-      </w:r>
-      <w:r>
-        <w:rPr>
-          <w:rStyle w:val="None"/>
-          <w:lang w:val="en-US"/>
-        </w:rPr>
-        <w:t xml:space="preserve">and linked to </w:t>
-      </w:r>
-      <w:r>
-        <w:rPr>
-          <w:rStyle w:val="None"/>
-          <w:lang w:val="en-US"/>
-        </w:rPr>
-        <w:t>SpiraPlan</w:t>
-      </w:r>
-      <w:r>
-        <w:rPr>
-          <w:rStyle w:val="None"/>
-          <w:lang w:val="en-US"/>
-        </w:rPr>
-        <w:t xml:space="preserve">, where </w:t>
-      </w:r>
-      <w:r>
-        <w:rPr>
-          <w:rStyle w:val="None"/>
-          <w:lang w:val="en-US"/>
-        </w:rPr>
-        <w:t xml:space="preserve">the </w:t>
-      </w:r>
-      <w:r>
-        <w:rPr>
-          <w:rStyle w:val="None"/>
-          <w:lang w:val="en-US"/>
-        </w:rPr>
-        <w:t xml:space="preserve">results </w:t>
-      </w:r>
-      <w:r>
-        <w:rPr>
-          <w:rStyle w:val="None"/>
-          <w:lang w:val="en-US"/>
-        </w:rPr>
-        <w:t>we</w:t>
-      </w:r>
-      <w:r>
-        <w:rPr>
-          <w:rStyle w:val="None"/>
-          <w:lang w:val="en-US"/>
-        </w:rPr>
-        <w:t xml:space="preserve">re recorded automatically, and all twenty tests </w:t>
-      </w:r>
-      <w:r>
-        <w:rPr>
-          <w:rStyle w:val="None"/>
-          <w:lang w:val="en-US"/>
-        </w:rPr>
-        <w:t>passed</w:t>
-      </w:r>
-      <w:r>
-        <w:rPr>
-          <w:rStyle w:val="None"/>
-          <w:lang w:val="en-US"/>
-        </w:rPr>
-        <w:t>.</w:t>
-      </w:r>
-    </w:p>
-    <w:p>
-      <w:pPr>
-        <w:pStyle w:val="Heading2"/>
-        <w:rPr>
-          <w:lang w:val="de-DE"/>
-        </w:rPr>
-      </w:pPr>
-      <w:r>
-        <w:rPr>
-          <w:rStyle w:val="None"/>
-          <w:lang w:val="de-DE"/>
-        </w:rPr>
-        <w:t>Student 4</w:t>
-      </w:r>
-    </w:p>
-    <w:p>
-      <w:pPr>
-        <w:pStyle w:val="BodyA"/>
-      </w:pPr>
-      <w:r>
-        <w:rPr>
-          <w:rStyle w:val="None"/>
-          <w:lang w:val="de-DE"/>
-        </w:rPr>
-        <w:t xml:space="preserve">Name: </w:t>
-      </w:r>
-      <w:r>
-        <w:rPr>
-          <w:rStyle w:val="None"/>
-          <w:lang w:val="en-US"/>
-        </w:rPr>
-        <w:t>Kavya Thampan</w:t>
-      </w:r>
-      <w:r>
-        <w:rPr>
-          <w:rStyle w:val="None"/>
-          <w:lang w:val="de-DE"/>
-        </w:rPr>
-        <w:t xml:space="preserve">    Student ID: </w:t>
-      </w:r>
-      <w:r>
-        <w:rPr>
-          <w:rStyle w:val="None"/>
-          <w:lang w:val="en-US"/>
-        </w:rPr>
-        <w:t>s4139615</w:t>
-      </w:r>
-    </w:p>
-    <w:p>
-      <w:pPr>
-        <w:pStyle w:val="BodyA"/>
-      </w:pPr>
-      <w:r>
-        <w:rPr>
-          <w:rStyle w:val="None"/>
-          <w:lang w:val="de-DE"/>
-        </w:rPr>
-        <w:t xml:space="preserve">GitHub Name: </w:t>
-      </w:r>
-      <w:r>
-        <w:rPr>
-          <w:rStyle w:val="None"/>
-          <w:lang w:val="en-US"/>
-        </w:rPr>
-        <w:t>Kavs2k</w:t>
-      </w:r>
-    </w:p>
-    <w:p>
-      <w:pPr>
-        <w:pStyle w:val="BodyA"/>
-      </w:pPr>
-      <w:r>
-        <w:rPr>
-          <w:rStyle w:val="None"/>
-          <w:lang w:val="en-US"/>
-        </w:rPr>
-        <w:t>Contribution areas (tick all that apply):</w:t>
-      </w:r>
-    </w:p>
-    <w:p>
-      <w:pPr>
-        <w:pStyle w:val="BodyA"/>
-      </w:pPr>
-      <w:r>
-        <w:rPr>
-          <w:rStyle w:val="None"/>
-        </w:rPr>
-        <w:t xml:space="preserve">☐ </w:t>
-      </w:r>
-      <w:r>
-        <w:rPr>
-          <w:rStyle w:val="None"/>
-          <w:lang w:val="de-DE"/>
-        </w:rPr>
-        <w:t xml:space="preserve">JMeter test plan/execution   </w:t>
-      </w:r>
-      <w:r>
-        <w:rPr>
-          <w:rStyle w:val="None"/>
-        </w:rPr>
-        <w:t xml:space="preserve">☐ </w:t>
-      </w:r>
-      <w:r>
-        <w:rPr>
-          <w:rStyle w:val="None"/>
-          <w:lang w:val="de-DE"/>
-        </w:rPr>
-        <w:t xml:space="preserve">JMeter analysis   </w:t>
-      </w:r>
-      <w:r>
-        <w:rPr>
-          <w:rStyle w:val="None"/>
-          <w:lang w:val="en-US"/>
-        </w:rPr>
-        <w:t>X</w:t>
-      </w:r>
-      <w:r>
-        <w:rPr>
-          <w:rStyle w:val="None"/>
-        </w:rPr>
-        <w:t xml:space="preserve"> Selenium tests</w:t>
-      </w:r>
-      <w:r>
-        <w:rPr>
-          <w:rStyle w:val="None"/>
-        </w:rPr>
-        <w:br/>
-      </w:r>
-      <w:r>
-        <w:rPr>
-          <w:rStyle w:val="None"/>
-          <w:lang w:val="en-US"/>
-        </w:rPr>
-        <w:t xml:space="preserve">X </w:t>
-      </w:r>
-      <w:r>
-        <w:rPr>
-          <w:rStyle w:val="None"/>
-          <w:lang w:val="de-DE"/>
-        </w:rPr>
-        <w:t xml:space="preserve">SpiraPlan integration   </w:t>
-      </w:r>
-      <w:r>
-        <w:rPr>
-          <w:rStyle w:val="None"/>
-        </w:rPr>
-        <w:t xml:space="preserve">☐ </w:t>
-      </w:r>
-      <w:r>
-        <w:rPr>
-          <w:rStyle w:val="None"/>
-          <w:lang w:val="en-US"/>
-        </w:rPr>
-        <w:t>Cucumber tests   X Code review/debugging/integration</w:t>
-      </w:r>
-    </w:p>
-    <w:p>
-      <w:pPr>
-        <w:pStyle w:val="BodyA"/>
-      </w:pPr>
-      <w:r>
-        <w:rPr>
-          <w:rStyle w:val="None"/>
-          <w:lang w:val="en-US"/>
-        </w:rPr>
-        <w:t>Specific work completed: Worked on the Selenium project and Spira integration setup, 16 automated tests for Open New Account and Bill Pay with Spira test cases, test sets and logged incidents, and the Selenium video presentation.</w:t>
-      </w:r>
-    </w:p>
-    <w:p>
-      <w:pPr>
-        <w:pStyle w:val="Heading2"/>
-        <w:rPr>
-          <w:lang w:val="de-DE"/>
-        </w:rPr>
-      </w:pPr>
-      <w:r>
-        <w:rPr>
-          <w:rStyle w:val="None"/>
-          <w:lang w:val="de-DE"/>
-        </w:rPr>
-        <w:t>Student 5</w:t>
-      </w:r>
-    </w:p>
-    <w:p>
-      <w:pPr>
-        <w:pStyle w:val="BodyA"/>
-      </w:pPr>
-      <w:r>
-        <w:rPr>
-          <w:rStyle w:val="None"/>
-          <w:lang w:val="en-US"/>
-        </w:rPr>
-        <w:t xml:space="preserve">Name: </w:t>
-      </w:r>
-      <w:r>
-        <w:rPr>
-          <w:rStyle w:val="None"/>
-          <w:lang w:val="en-US"/>
-        </w:rPr>
-        <w:t>Thashi Maleesa Godahewa</w:t>
-      </w:r>
-      <w:r>
-        <w:rPr>
-          <w:rStyle w:val="None"/>
-          <w:lang w:val="en-US"/>
-        </w:rPr>
-        <w:t xml:space="preserve">          </w:t>
-      </w:r>
-      <w:r>
-        <w:rPr>
-          <w:rStyle w:val="None"/>
-          <w:lang w:val="en-US"/>
-        </w:rPr>
-        <w:t xml:space="preserve">  Student ID:</w:t>
-      </w:r>
-      <w:r>
-        <w:rPr>
-          <w:rStyle w:val="None"/>
-          <w:lang w:val="en-US"/>
-        </w:rPr>
-        <w:t xml:space="preserve"> </w:t>
-      </w:r>
-      <w:r>
-        <w:rPr>
-          <w:rStyle w:val="None"/>
-          <w:lang w:val="en-US"/>
-        </w:rPr>
-        <w:t>s</w:t>
-      </w:r>
-      <w:r>
-        <w:rPr>
-          <w:rStyle w:val="None"/>
-          <w:lang w:val="en-US"/>
-        </w:rPr>
-        <w:t>4143272</w:t>
-      </w:r>
-    </w:p>
-    <w:p>
-      <w:pPr>
-        <w:pStyle w:val="BodyA"/>
-      </w:pPr>
-      <w:r>
-        <w:rPr>
-          <w:rStyle w:val="None"/>
-          <w:lang w:val="en-US"/>
-        </w:rPr>
-        <w:t xml:space="preserve">GitHub Name: </w:t>
-      </w:r>
-      <w:hyperlink w:history="1" r:id="rId7">
+      <w:hyperlink r:id="rId8" w:history="1">
         <w:r>
           <w:rPr>
             <w:rStyle w:val="None"/>
@@ -1205,7 +1161,60 @@
         <w:rPr>
           <w:rStyle w:val="None"/>
         </w:rPr>
-        <w:t>☐</w:t>
+        <w:t xml:space="preserve">☐ </w:t>
+      </w:r>
+      <w:r>
+        <w:rPr>
+          <w:rStyle w:val="None"/>
+          <w:lang w:val="de-DE"/>
+        </w:rPr>
+        <w:t xml:space="preserve">JMeter test plan/execution   </w:t>
+      </w:r>
+      <w:r>
+        <w:rPr>
+          <w:rStyle w:val="None"/>
+        </w:rPr>
+        <w:t xml:space="preserve">☐ </w:t>
+      </w:r>
+      <w:r>
+        <w:rPr>
+          <w:rStyle w:val="None"/>
+          <w:lang w:val="de-DE"/>
+        </w:rPr>
+        <w:t xml:space="preserve">JMeter analysis   </w:t>
+      </w:r>
+      <w:proofErr w:type="gramStart"/>
+      <w:r>
+        <w:rPr>
+          <w:rStyle w:val="None"/>
+        </w:rPr>
+        <w:t xml:space="preserve">X </w:t>
+      </w:r>
+      <w:r>
+        <w:rPr>
+          <w:rStyle w:val="None"/>
+        </w:rPr>
+        <w:t xml:space="preserve"> Selenium</w:t>
+      </w:r>
+      <w:proofErr w:type="gramEnd"/>
+      <w:r>
+        <w:rPr>
+          <w:rStyle w:val="None"/>
+        </w:rPr>
+        <w:t xml:space="preserve"> tests</w:t>
+      </w:r>
+      <w:r>
+        <w:rPr>
+          <w:rStyle w:val="None"/>
+        </w:rPr>
+        <w:br/>
+      </w:r>
+      <w:proofErr w:type="gramStart"/>
+      <w:r>
+        <w:rPr>
+          <w:rStyle w:val="None"/>
+        </w:rPr>
+        <w:t xml:space="preserve">X </w:t>
       </w:r>
       <w:r>
         <w:rPr>
@@ -1218,19 +1227,283 @@
           <w:rStyle w:val="None"/>
           <w:lang w:val="de-DE"/>
         </w:rPr>
+        <w:t>SpiraPlan</w:t>
+      </w:r>
+      <w:proofErr w:type="gramEnd"/>
+      <w:r>
+        <w:rPr>
+          <w:rStyle w:val="None"/>
+          <w:lang w:val="de-DE"/>
+        </w:rPr>
+        <w:t xml:space="preserve"> integration   </w:t>
+      </w:r>
+      <w:r>
+        <w:rPr>
+          <w:rStyle w:val="None"/>
+        </w:rPr>
+        <w:t xml:space="preserve">☐ </w:t>
+      </w:r>
+      <w:r>
+        <w:rPr>
+          <w:rStyle w:val="None"/>
+          <w:lang w:val="en-US"/>
+        </w:rPr>
+        <w:t xml:space="preserve">Cucumber tests   </w:t>
+      </w:r>
+      <w:r>
+        <w:rPr>
+          <w:rStyle w:val="None"/>
+        </w:rPr>
+        <w:t>X</w:t>
+      </w:r>
+      <w:r>
+        <w:rPr>
+          <w:rStyle w:val="None"/>
+        </w:rPr>
+        <w:t xml:space="preserve"> </w:t>
+      </w:r>
+      <w:r>
+        <w:rPr>
+          <w:rStyle w:val="None"/>
+          <w:lang w:val="en-US"/>
+        </w:rPr>
+        <w:t>Code review/debugging/integration</w:t>
+      </w:r>
+    </w:p>
+    <w:p>
+      <w:pPr>
+        <w:pStyle w:val="BodyA"/>
+      </w:pPr>
+      <w:r>
+        <w:rPr>
+          <w:rStyle w:val="None"/>
+          <w:lang w:val="en-US"/>
+        </w:rPr>
+        <w:t xml:space="preserve">Specific work completed: </w:t>
+      </w:r>
+      <w:r>
+        <w:rPr>
+          <w:rStyle w:val="None"/>
+          <w:lang w:val="en-US"/>
+        </w:rPr>
+        <w:t xml:space="preserve">Implemented Selenium test cases for Loan Request </w:t>
+      </w:r>
+      <w:r>
+        <w:rPr>
+          <w:rStyle w:val="None"/>
+          <w:lang w:val="en-US"/>
+        </w:rPr>
+        <w:t>and</w:t>
+      </w:r>
+      <w:r>
+        <w:rPr>
+          <w:rStyle w:val="None"/>
+          <w:lang w:val="en-US"/>
+        </w:rPr>
+        <w:t xml:space="preserve"> Find Transactions using Java and Selenium WebDriver. </w:t>
+      </w:r>
+      <w:r>
+        <w:rPr>
+          <w:rStyle w:val="None"/>
+          <w:lang w:val="en-US"/>
+        </w:rPr>
+        <w:t>And</w:t>
+      </w:r>
+      <w:r>
+        <w:rPr>
+          <w:rStyle w:val="None"/>
+          <w:lang w:val="en-US"/>
+        </w:rPr>
+        <w:t xml:space="preserve"> integrated the automated tests with </w:t>
+      </w:r>
+      <w:proofErr w:type="spellStart"/>
+      <w:r>
+        <w:rPr>
+          <w:rStyle w:val="None"/>
+          <w:lang w:val="en-US"/>
+        </w:rPr>
+        <w:t>SpiraPlan</w:t>
+      </w:r>
+      <w:proofErr w:type="spellEnd"/>
+      <w:r>
+        <w:rPr>
+          <w:rStyle w:val="None"/>
+          <w:lang w:val="en-US"/>
+        </w:rPr>
+        <w:t xml:space="preserve"> by creating and linking requirements, mapping test cases to their corresponding Spira IDs, and </w:t>
+      </w:r>
+      <w:proofErr w:type="spellStart"/>
+      <w:r>
+        <w:rPr>
+          <w:rStyle w:val="None"/>
+          <w:lang w:val="en-US"/>
+        </w:rPr>
+        <w:t>organising</w:t>
+      </w:r>
+      <w:proofErr w:type="spellEnd"/>
+      <w:r>
+        <w:rPr>
+          <w:rStyle w:val="None"/>
+          <w:lang w:val="en-US"/>
+        </w:rPr>
+        <w:t xml:space="preserve"> them into test sets. </w:t>
+      </w:r>
+      <w:r>
+        <w:rPr>
+          <w:rStyle w:val="None"/>
+          <w:lang w:val="en-US"/>
+        </w:rPr>
+        <w:t>Also</w:t>
+      </w:r>
+      <w:r>
+        <w:rPr>
+          <w:rStyle w:val="None"/>
+          <w:lang w:val="en-US"/>
+        </w:rPr>
+        <w:t xml:space="preserve"> verified the test execution results, contributed to debugging and code integration, and helped ensure that all 15 test cases were successfully recorded</w:t>
+      </w:r>
+      <w:r>
+        <w:rPr>
+          <w:rStyle w:val="None"/>
+          <w:lang w:val="en-US"/>
+        </w:rPr>
+        <w:t xml:space="preserve"> </w:t>
+      </w:r>
+      <w:r>
+        <w:rPr>
+          <w:rStyle w:val="None"/>
+          <w:lang w:val="en-US"/>
+        </w:rPr>
+        <w:t xml:space="preserve">in </w:t>
+      </w:r>
+      <w:proofErr w:type="spellStart"/>
+      <w:r>
+        <w:rPr>
+          <w:rStyle w:val="None"/>
+          <w:lang w:val="en-US"/>
+        </w:rPr>
+        <w:t>SpiraPlan</w:t>
+      </w:r>
+      <w:proofErr w:type="spellEnd"/>
+      <w:r>
+        <w:rPr>
+          <w:rStyle w:val="None"/>
+          <w:lang w:val="en-US"/>
+        </w:rPr>
+        <w:t>.</w:t>
+      </w:r>
+    </w:p>
+    <w:p>
+      <w:pPr>
+        <w:pStyle w:val="Heading2"/>
+        <w:rPr>
+          <w:lang w:val="de-DE"/>
+        </w:rPr>
+      </w:pPr>
+      <w:r>
+        <w:rPr>
+          <w:rStyle w:val="None"/>
+          <w:lang w:val="de-DE"/>
+        </w:rPr>
+        <w:t>Student 6</w:t>
+      </w:r>
+    </w:p>
+    <w:p>
+      <w:pPr>
+        <w:pStyle w:val="BodyA"/>
+      </w:pPr>
+      <w:r>
+        <w:rPr>
+          <w:rStyle w:val="None"/>
+          <w:lang w:val="pt-PT"/>
+        </w:rPr>
+        <w:t>Name: Purna Mahanthegama Peramune   Student ID: s4142480</w:t>
+      </w:r>
+    </w:p>
+    <w:p>
+      <w:pPr>
+        <w:pStyle w:val="BodyA"/>
+      </w:pPr>
+      <w:r>
+        <w:rPr>
+          <w:rStyle w:val="None"/>
+          <w:lang w:val="de-DE"/>
+        </w:rPr>
+        <w:t>GitHub Name: purnaperamune (</w:t>
+      </w:r>
+      <w:r>
+        <w:rPr>
+          <w:rStyle w:val="Hyperlink1"/>
+        </w:rPr>
+        <w:fldChar w:fldCharType="begin"/>
+      </w:r>
+      <w:r>
+        <w:rPr>
+          <w:rStyle w:val="Hyperlink1"/>
+        </w:rPr>
+        <w:instrText xml:space="preserve"> HYPERLINK "https://github.com/purnaperamune"</w:instrText>
+      </w:r>
+      <w:r>
+        <w:rPr>
+          <w:rStyle w:val="Hyperlink1"/>
+        </w:rPr>
+      </w:r>
+      <w:r>
+        <w:rPr>
+          <w:rStyle w:val="Hyperlink1"/>
+        </w:rPr>
+        <w:fldChar w:fldCharType="separate"/>
+      </w:r>
+      <w:r>
+        <w:rPr>
+          <w:rStyle w:val="Hyperlink1"/>
+        </w:rPr>
+        <w:t>https://github.com/purnaperamune</w:t>
+      </w:r>
+      <w:r>
+        <w:fldChar w:fldCharType="end"/>
+      </w:r>
+      <w:r>
+        <w:rPr>
+          <w:rStyle w:val="None"/>
+        </w:rPr>
+        <w:t>)</w:t>
+      </w:r>
+    </w:p>
+    <w:p>
+      <w:pPr>
+        <w:pStyle w:val="BodyA"/>
+      </w:pPr>
+      <w:r>
+        <w:rPr>
+          <w:rStyle w:val="None"/>
+          <w:lang w:val="en-US"/>
+        </w:rPr>
+        <w:t>Contribution areas (tick all that apply):</w:t>
+      </w:r>
+    </w:p>
+    <w:p>
+      <w:pPr>
+        <w:pStyle w:val="BodyA"/>
+      </w:pPr>
+      <w:r>
+        <w:rPr>
+          <w:rStyle w:val="None"/>
+        </w:rPr>
+        <w:t xml:space="preserve">☐ </w:t>
+      </w:r>
+      <w:r>
+        <w:rPr>
+          <w:rStyle w:val="None"/>
+          <w:lang w:val="de-DE"/>
+        </w:rPr>
         <w:t xml:space="preserve">JMeter test plan/execution   </w:t>
       </w:r>
       <w:r>
         <w:rPr>
           <w:rStyle w:val="None"/>
         </w:rPr>
-        <w:t>☐</w:t>
-      </w:r>
-      <w:r>
-        <w:rPr>
-          <w:rStyle w:val="None"/>
-        </w:rPr>
-        <w:t xml:space="preserve"> </w:t>
+        <w:t xml:space="preserve">☐ </w:t>
       </w:r>
       <w:r>
         <w:rPr>
@@ -1243,76 +1516,30 @@
         <w:rPr>
           <w:rStyle w:val="None"/>
         </w:rPr>
-        <w:t xml:space="preserve">X </w:t>
-      </w:r>
-      <w:r>
-        <w:rPr>
-          <w:rStyle w:val="None"/>
-        </w:rPr>
-        <w:t xml:space="preserve"> Selenium tests</w:t>
+        <w:t>☐ Selenium tests</w:t>
       </w:r>
       <w:r>
         <w:rPr>
           <w:rStyle w:val="None"/>
         </w:rPr>
         <w:br/>
-      </w:r>
-      <w:r>
-        <w:rPr>
-          <w:rStyle w:val="None"/>
-        </w:rPr>
-        <w:t xml:space="preserve">X </w:t>
-      </w:r>
-      <w:r>
-        <w:rPr>
-          <w:rStyle w:val="None"/>
-        </w:rPr>
-        <w:t xml:space="preserve"> </w:t>
-      </w:r>
-      <w:r>
-        <w:rPr>
-          <w:rStyle w:val="None"/>
-          <w:lang w:val="de-DE"/>
-        </w:rPr>
-        <w:t xml:space="preserve">SpiraPlan integration   </w:t>
-      </w:r>
-      <w:r>
-        <w:rPr>
-          <w:rStyle w:val="None"/>
-        </w:rPr>
-        <w:t>☐</w:t>
-      </w:r>
-      <w:r>
-        <w:rPr>
-          <w:rStyle w:val="None"/>
-        </w:rPr>
-        <w:t xml:space="preserve"> </w:t>
-      </w:r>
-      <w:r>
-        <w:rPr>
-          <w:rStyle w:val="None"/>
-          <w:lang w:val="en-US"/>
-        </w:rPr>
-        <w:t xml:space="preserve">Cucumber tests   </w:t>
-      </w:r>
-      <w:r>
-        <w:rPr>
-          <w:rStyle w:val="None"/>
-        </w:rPr>
-        <w:t>X</w:t>
-      </w:r>
-      <w:r>
-        <w:rPr>
-          <w:rStyle w:val="None"/>
-        </w:rPr>
-        <w:t xml:space="preserve"> </w:t>
-      </w:r>
-      <w:r>
-        <w:rPr>
-          <w:rStyle w:val="None"/>
-          <w:lang w:val="en-US"/>
-        </w:rPr>
-        <w:t>Code review/debugging/integration</w:t>
+        <w:t xml:space="preserve">☐ </w:t>
+      </w:r>
+      <w:proofErr w:type="spellStart"/>
+      <w:r>
+        <w:rPr>
+          <w:rStyle w:val="None"/>
+          <w:lang w:val="en-US"/>
+        </w:rPr>
+        <w:t>SpiraPlan</w:t>
+      </w:r>
+      <w:proofErr w:type="spellEnd"/>
+      <w:r>
+        <w:rPr>
+          <w:rStyle w:val="None"/>
+          <w:lang w:val="en-US"/>
+        </w:rPr>
+        <w:t xml:space="preserve"> integration   X Cucumber tests   X Code review/debugging/integration</w:t>
       </w:r>
     </w:p>
     <w:p>
@@ -1324,272 +1551,52 @@
           <w:rStyle w:val="None"/>
           <w:lang w:val="en-US"/>
         </w:rPr>
-        <w:t xml:space="preserve">Specific work completed: </w:t>
-      </w:r>
-      <w:r>
-        <w:rPr>
-          <w:rStyle w:val="None"/>
-          <w:lang w:val="en-US"/>
-        </w:rPr>
-        <w:t xml:space="preserve">Implemented Selenium test cases for Loan Request </w:t>
-      </w:r>
-      <w:r>
-        <w:rPr>
-          <w:rStyle w:val="None"/>
-          <w:lang w:val="en-US"/>
-        </w:rPr>
-        <w:t>and</w:t>
-      </w:r>
-      <w:r>
-        <w:rPr>
-          <w:rStyle w:val="None"/>
-          <w:lang w:val="en-US"/>
-        </w:rPr>
-        <w:t xml:space="preserve"> Find Transactions using Java and Selenium WebDriver. </w:t>
-      </w:r>
-      <w:r>
-        <w:rPr>
-          <w:rStyle w:val="None"/>
-          <w:lang w:val="en-US"/>
-        </w:rPr>
-        <w:t>And</w:t>
-      </w:r>
-      <w:r>
-        <w:rPr>
-          <w:rStyle w:val="None"/>
-          <w:lang w:val="en-US"/>
-        </w:rPr>
-        <w:t xml:space="preserve"> integrated the automated tests with </w:t>
-      </w:r>
-      <w:proofErr w:type="spellStart"/>
-      <w:r>
-        <w:rPr>
-          <w:rStyle w:val="None"/>
-          <w:lang w:val="en-US"/>
-        </w:rPr>
-        <w:t>SpiraPlan</w:t>
-      </w:r>
-      <w:proofErr w:type="spellEnd"/>
-      <w:r>
-        <w:rPr>
-          <w:rStyle w:val="None"/>
-          <w:lang w:val="en-US"/>
-        </w:rPr>
-        <w:t xml:space="preserve"> by creating and linking requirements, mapping test cases to their corresponding Spira IDs, and </w:t>
-      </w:r>
-      <w:proofErr w:type="spellStart"/>
-      <w:r>
-        <w:rPr>
-          <w:rStyle w:val="None"/>
-          <w:lang w:val="en-US"/>
-        </w:rPr>
-        <w:t>organising</w:t>
-      </w:r>
-      <w:proofErr w:type="spellEnd"/>
-      <w:r>
-        <w:rPr>
-          <w:rStyle w:val="None"/>
-          <w:lang w:val="en-US"/>
-        </w:rPr>
-        <w:t xml:space="preserve"> them into test sets. </w:t>
-      </w:r>
-      <w:r>
-        <w:rPr>
-          <w:rStyle w:val="None"/>
-          <w:lang w:val="en-US"/>
-        </w:rPr>
-        <w:t>Also</w:t>
-      </w:r>
-      <w:r>
-        <w:rPr>
-          <w:rStyle w:val="None"/>
-          <w:lang w:val="en-US"/>
-        </w:rPr>
-        <w:t xml:space="preserve"> verified the test execution results, contributed to debugging and code integration, and helped ensure that all 15 test cases were successfully recorded</w:t>
-      </w:r>
-      <w:r>
-        <w:rPr>
-          <w:rStyle w:val="None"/>
-          <w:lang w:val="en-US"/>
-        </w:rPr>
-        <w:t xml:space="preserve"> </w:t>
-      </w:r>
-      <w:r>
-        <w:rPr>
-          <w:rStyle w:val="None"/>
-          <w:lang w:val="en-US"/>
-        </w:rPr>
-        <w:t xml:space="preserve">in </w:t>
-      </w:r>
-      <w:proofErr w:type="spellStart"/>
-      <w:r>
-        <w:rPr>
-          <w:rStyle w:val="None"/>
-          <w:lang w:val="en-US"/>
-        </w:rPr>
-        <w:t>SpiraPlan</w:t>
-      </w:r>
-      <w:proofErr w:type="spellEnd"/>
-      <w:r>
-        <w:rPr>
-          <w:rStyle w:val="None"/>
-          <w:lang w:val="en-US"/>
-        </w:rPr>
-        <w:t>.</w:t>
-      </w:r>
-    </w:p>
-    <w:p>
-      <w:pPr>
-        <w:pStyle w:val="Heading2"/>
-        <w:rPr>
-          <w:lang w:val="de-DE"/>
-        </w:rPr>
-      </w:pPr>
-      <w:r>
-        <w:rPr>
-          <w:rStyle w:val="None"/>
-          <w:lang w:val="de-DE"/>
-        </w:rPr>
-        <w:t>Student 6</w:t>
+        <w:t>Specific work completed: Worked on whole Part C of the assignment. BDD testing with Cucumber. Helped to review each other</w:t>
+      </w:r>
+      <w:r>
+        <w:rPr>
+          <w:rStyle w:val="None"/>
+          <w:rtl/>
+        </w:rPr>
+        <w:t>’</w:t>
+      </w:r>
+      <w:r>
+        <w:rPr>
+          <w:rStyle w:val="None"/>
+          <w:lang w:val="en-US"/>
+        </w:rPr>
+        <w:t>s work as a team.</w:t>
       </w:r>
     </w:p>
     <w:p>
       <w:pPr>
         <w:pStyle w:val="BodyA"/>
       </w:pPr>
-      <w:r>
-        <w:rPr>
-          <w:rStyle w:val="None"/>
-          <w:lang w:val="pt-PT"/>
-        </w:rPr>
-        <w:t>Name: Purna Mahanthegama Peramune   Student ID: s4142480</w:t>
-      </w:r>
     </w:p>
     <w:p>
       <w:pPr>
         <w:pStyle w:val="BodyA"/>
       </w:pPr>
-      <w:r>
-        <w:rPr>
-          <w:rStyle w:val="None"/>
-          <w:lang w:val="de-DE"/>
-        </w:rPr>
-        <w:t>GitHub Name: purnaperamune (</w:t>
-      </w:r>
-      <w:r>
-        <w:rPr>
-          <w:rStyle w:val="Hyperlink1"/>
-        </w:rPr>
-        <w:fldChar w:fldCharType="begin"/>
-      </w:r>
-      <w:r>
-        <w:rPr>
-          <w:rStyle w:val="Hyperlink1"/>
-        </w:rPr>
-        <w:instrText xml:space="preserve"> HYPERLINK "https://github.com/purnaperamune"</w:instrText>
-      </w:r>
-      <w:r>
-        <w:rPr>
-          <w:rStyle w:val="Hyperlink1"/>
-        </w:rPr>
-      </w:r>
-      <w:r>
-        <w:rPr>
-          <w:rStyle w:val="Hyperlink1"/>
-        </w:rPr>
-        <w:fldChar w:fldCharType="separate"/>
-      </w:r>
-      <w:r>
-        <w:rPr>
-          <w:rStyle w:val="Hyperlink1"/>
-        </w:rPr>
-        <w:t>https://github.com/purnaperamune</w:t>
-      </w:r>
-      <w:r>
-        <w:fldChar w:fldCharType="end"/>
-      </w:r>
-      <w:r>
-        <w:rPr>
-          <w:rStyle w:val="None"/>
-        </w:rPr>
-        <w:t>)</w:t>
-      </w:r>
     </w:p>
     <w:p>
       <w:pPr>
         <w:pStyle w:val="BodyA"/>
       </w:pPr>
-      <w:r>
-        <w:rPr>
-          <w:rStyle w:val="None"/>
-          <w:lang w:val="en-US"/>
-        </w:rPr>
-        <w:t>Contribution areas (tick all that apply):</w:t>
-      </w:r>
     </w:p>
     <w:p>
       <w:pPr>
         <w:pStyle w:val="BodyA"/>
       </w:pPr>
-      <w:r>
-        <w:rPr>
-          <w:rStyle w:val="None"/>
-        </w:rPr>
-        <w:t xml:space="preserve">☐ </w:t>
-      </w:r>
-      <w:r>
-        <w:rPr>
-          <w:rStyle w:val="None"/>
-          <w:lang w:val="de-DE"/>
-        </w:rPr>
-        <w:t xml:space="preserve">JMeter test plan/execution   </w:t>
-      </w:r>
-      <w:r>
-        <w:rPr>
-          <w:rStyle w:val="None"/>
-        </w:rPr>
-        <w:t xml:space="preserve">☐ </w:t>
-      </w:r>
-      <w:r>
-        <w:rPr>
-          <w:rStyle w:val="None"/>
-          <w:lang w:val="de-DE"/>
-        </w:rPr>
-        <w:t xml:space="preserve">JMeter analysis   </w:t>
-      </w:r>
-      <w:r>
-        <w:rPr>
-          <w:rStyle w:val="None"/>
-        </w:rPr>
-        <w:t>☐ Selenium tests</w:t>
-      </w:r>
-      <w:r>
-        <w:rPr>
-          <w:rStyle w:val="None"/>
-        </w:rPr>
-        <w:br/>
-      </w:r>
-      <w:r>
-        <w:rPr>
-          <w:rStyle w:val="None"/>
-        </w:rPr>
-        <w:t xml:space="preserve">☐ </w:t>
-      </w:r>
-      <w:proofErr w:type="spellStart"/>
-      <w:r>
-        <w:rPr>
-          <w:rStyle w:val="None"/>
-          <w:lang w:val="en-US"/>
-        </w:rPr>
-        <w:t>SpiraPlan</w:t>
-      </w:r>
-      <w:proofErr w:type="spellEnd"/>
-      <w:r>
-        <w:rPr>
-          <w:rStyle w:val="None"/>
-          <w:lang w:val="en-US"/>
-        </w:rPr>
-        <w:t xml:space="preserve"> integration   X Cucumber tests   X Code review/debugging/integration</w:t>
+    </w:p>
+    <w:p>
+      <w:pPr>
+        <w:pStyle w:val="Heading"/>
+      </w:pPr>
+      <w:r>
+        <w:rPr>
+          <w:rStyle w:val="None"/>
+        </w:rPr>
+        <w:t>2. Agreed percentage contribution</w:t>
       </w:r>
     </w:p>
     <w:p>
@@ -1601,7 +1608,7 @@
           <w:rStyle w:val="None"/>
           <w:lang w:val="en-US"/>
         </w:rPr>
-        <w:t>Specific work completed: Worked on whole Part C of the assignment. BDD testing with Cucumber. Helped to review each other</w:t>
+        <w:t>Complete this table together after discussing each member</w:t>
       </w:r>
       <w:r>
         <w:rPr>
@@ -1615,64 +1622,23 @@
           <w:rStyle w:val="None"/>
           <w:lang w:val="en-US"/>
         </w:rPr>
-        <w:t>s work as a team.</w:t>
-      </w:r>
-    </w:p>
-    <w:p>
-      <w:pPr>
-        <w:pStyle w:val="BodyA"/>
-      </w:pPr>
-    </w:p>
-    <w:p>
-      <w:pPr>
-        <w:pStyle w:val="BodyA"/>
-      </w:pPr>
-    </w:p>
-    <w:p>
-      <w:pPr>
-        <w:pStyle w:val="BodyA"/>
-      </w:pPr>
-    </w:p>
-    <w:p>
-      <w:pPr>
-        <w:pStyle w:val="BodyA"/>
-      </w:pPr>
-    </w:p>
-    <w:p>
-      <w:pPr>
-        <w:pStyle w:val="Heading"/>
-      </w:pPr>
-      <w:r>
-        <w:rPr>
-          <w:rStyle w:val="None"/>
-        </w:rPr>
-        <w:t>2. Agreed percentage contribution</w:t>
-      </w:r>
-    </w:p>
-    <w:p>
-      <w:pPr>
-        <w:pStyle w:val="BodyA"/>
-      </w:pPr>
-      <w:r>
-        <w:rPr>
-          <w:rStyle w:val="None"/>
-          <w:lang w:val="en-US"/>
-        </w:rPr>
-        <w:t>Complete this table together after discussing each member</w:t>
-      </w:r>
-      <w:r>
-        <w:rPr>
-          <w:rStyle w:val="None"/>
-          <w:rtl/>
-        </w:rPr>
-        <w:t>’</w:t>
-      </w:r>
-      <w:r>
-        <w:rPr>
-          <w:rStyle w:val="None"/>
-          <w:lang w:val="en-US"/>
-        </w:rPr>
-        <w:t>s actual contribution. All members must agree to the final percentages. The percentages must total 100%. For a six-person group with equal contributions, each member contributes approximately 16.67%. For smaller groups, leave unused rows blank.</w:t>
+        <w:t xml:space="preserve">s actual contribution. All members must agree to the final percentages. The </w:t>
+      </w:r>
+      <w:proofErr w:type="gramStart"/>
+      <w:r>
+        <w:rPr>
+          <w:rStyle w:val="None"/>
+          <w:lang w:val="en-US"/>
+        </w:rPr>
+        <w:t>percentages</w:t>
+      </w:r>
+      <w:proofErr w:type="gramEnd"/>
+      <w:r>
+        <w:rPr>
+          <w:rStyle w:val="None"/>
+          <w:lang w:val="en-US"/>
+        </w:rPr>
+        <w:t xml:space="preserve"> must total 100%. For a six-person group with equal contributions, each member contributes approximately 16.67%. For smaller groups, leave unused rows blank.</w:t>
       </w:r>
     </w:p>
     <w:tbl>
@@ -1680,12 +1646,12 @@
         <w:tblW w:w="8640" w:type="dxa"/>
         <w:tblInd w:w="216" w:type="dxa"/>
         <w:tblBorders>
-          <w:top w:val="single" w:color="FFFFFF" w:sz="8" w:space="0"/>
-          <w:left w:val="single" w:color="FFFFFF" w:sz="8" w:space="0"/>
-          <w:bottom w:val="single" w:color="FFFFFF" w:sz="8" w:space="0"/>
-          <w:right w:val="single" w:color="FFFFFF" w:sz="8" w:space="0"/>
-          <w:insideH w:val="single" w:color="FFFFFF" w:sz="8" w:space="0"/>
-          <w:insideV w:val="single" w:color="FFFFFF" w:sz="8" w:space="0"/>
+          <w:top w:val="single" w:sz="8" w:space="0" w:color="FFFFFF"/>
+          <w:left w:val="single" w:sz="8" w:space="0" w:color="FFFFFF"/>
+          <w:bottom w:val="single" w:sz="8" w:space="0" w:color="FFFFFF"/>
+          <w:right w:val="single" w:sz="8" w:space="0" w:color="FFFFFF"/>
+          <w:insideH w:val="single" w:sz="8" w:space="0" w:color="FFFFFF"/>
+          <w:insideV w:val="single" w:sz="8" w:space="0" w:color="FFFFFF"/>
         </w:tblBorders>
         <w:shd w:val="clear" w:color="auto" w:fill="CED7E7"/>
         <w:tblLayout w:type="fixed"/>
@@ -1704,10 +1670,10 @@
           <w:tcPr>
             <w:tcW w:w="2880" w:type="dxa"/>
             <w:tcBorders>
-              <w:top w:val="single" w:color="000000" w:sz="4" w:space="0"/>
-              <w:left w:val="single" w:color="000000" w:sz="4" w:space="0"/>
-              <w:bottom w:val="single" w:color="000000" w:sz="4" w:space="0"/>
-              <w:right w:val="single" w:color="000000" w:sz="4" w:space="0"/>
+              <w:top w:val="single" w:sz="4" w:space="0" w:color="000000"/>
+              <w:left w:val="single" w:sz="4" w:space="0" w:color="000000"/>
+              <w:bottom w:val="single" w:sz="4" w:space="0" w:color="000000"/>
+              <w:right w:val="single" w:sz="4" w:space="0" w:color="000000"/>
             </w:tcBorders>
             <w:tcMar>
               <w:top w:w="80" w:type="dxa"/>
@@ -1733,10 +1699,10 @@
           <w:tcPr>
             <w:tcW w:w="2880" w:type="dxa"/>
             <w:tcBorders>
-              <w:top w:val="single" w:color="000000" w:sz="4" w:space="0"/>
-              <w:left w:val="single" w:color="000000" w:sz="4" w:space="0"/>
-              <w:bottom w:val="single" w:color="000000" w:sz="4" w:space="0"/>
-              <w:right w:val="single" w:color="000000" w:sz="4" w:space="0"/>
+              <w:top w:val="single" w:sz="4" w:space="0" w:color="000000"/>
+              <w:left w:val="single" w:sz="4" w:space="0" w:color="000000"/>
+              <w:bottom w:val="single" w:sz="4" w:space="0" w:color="000000"/>
+              <w:right w:val="single" w:sz="4" w:space="0" w:color="000000"/>
             </w:tcBorders>
             <w:tcMar>
               <w:top w:w="80" w:type="dxa"/>
@@ -1763,10 +1729,10 @@
           <w:tcPr>
             <w:tcW w:w="2880" w:type="dxa"/>
             <w:tcBorders>
-              <w:top w:val="single" w:color="000000" w:sz="4" w:space="0"/>
-              <w:left w:val="single" w:color="000000" w:sz="4" w:space="0"/>
-              <w:bottom w:val="single" w:color="000000" w:sz="4" w:space="0"/>
-              <w:right w:val="single" w:color="000000" w:sz="4" w:space="0"/>
+              <w:top w:val="single" w:sz="4" w:space="0" w:color="000000"/>
+              <w:left w:val="single" w:sz="4" w:space="0" w:color="000000"/>
+              <w:bottom w:val="single" w:sz="4" w:space="0" w:color="000000"/>
+              <w:right w:val="single" w:sz="4" w:space="0" w:color="000000"/>
             </w:tcBorders>
             <w:tcMar>
               <w:top w:w="80" w:type="dxa"/>
@@ -1798,10 +1764,10 @@
           <w:tcPr>
             <w:tcW w:w="2880" w:type="dxa"/>
             <w:tcBorders>
-              <w:top w:val="single" w:color="000000" w:sz="4" w:space="0"/>
-              <w:left w:val="single" w:color="000000" w:sz="4" w:space="0"/>
-              <w:bottom w:val="single" w:color="000000" w:sz="4" w:space="0"/>
-              <w:right w:val="single" w:color="000000" w:sz="4" w:space="0"/>
+              <w:top w:val="single" w:sz="4" w:space="0" w:color="000000"/>
+              <w:left w:val="single" w:sz="4" w:space="0" w:color="000000"/>
+              <w:bottom w:val="single" w:sz="4" w:space="0" w:color="000000"/>
+              <w:right w:val="single" w:sz="4" w:space="0" w:color="000000"/>
             </w:tcBorders>
             <w:tcMar>
               <w:top w:w="80" w:type="dxa"/>
@@ -1828,10 +1794,10 @@
           <w:tcPr>
             <w:tcW w:w="2880" w:type="dxa"/>
             <w:tcBorders>
-              <w:top w:val="single" w:color="000000" w:sz="4" w:space="0"/>
-              <w:left w:val="single" w:color="000000" w:sz="4" w:space="0"/>
-              <w:bottom w:val="single" w:color="000000" w:sz="4" w:space="0"/>
-              <w:right w:val="single" w:color="000000" w:sz="4" w:space="0"/>
+              <w:top w:val="single" w:sz="4" w:space="0" w:color="000000"/>
+              <w:left w:val="single" w:sz="4" w:space="0" w:color="000000"/>
+              <w:bottom w:val="single" w:sz="4" w:space="0" w:color="000000"/>
+              <w:right w:val="single" w:sz="4" w:space="0" w:color="000000"/>
             </w:tcBorders>
             <w:tcMar>
               <w:top w:w="80" w:type="dxa"/>
@@ -1855,10 +1821,10 @@
           <w:tcPr>
             <w:tcW w:w="2880" w:type="dxa"/>
             <w:tcBorders>
-              <w:top w:val="single" w:color="000000" w:sz="4" w:space="0"/>
-              <w:left w:val="single" w:color="000000" w:sz="4" w:space="0"/>
-              <w:bottom w:val="single" w:color="000000" w:sz="4" w:space="0"/>
-              <w:right w:val="single" w:color="000000" w:sz="4" w:space="0"/>
+              <w:top w:val="single" w:sz="4" w:space="0" w:color="000000"/>
+              <w:left w:val="single" w:sz="4" w:space="0" w:color="000000"/>
+              <w:bottom w:val="single" w:sz="4" w:space="0" w:color="000000"/>
+              <w:right w:val="single" w:sz="4" w:space="0" w:color="000000"/>
             </w:tcBorders>
             <w:tcMar>
               <w:top w:w="80" w:type="dxa"/>
@@ -1871,7 +1837,7 @@
             <w:pPr>
               <w:rPr>
                 <w:rStyle w:val="None"/>
-                <w:rFonts w:ascii="Aptos" w:hAnsi="Aptos" w:eastAsia="Aptos" w:cs="Aptos"/>
+                <w:rFonts w:ascii="Aptos" w:eastAsia="Aptos" w:hAnsi="Aptos" w:cs="Aptos"/>
                 <w:color w:val="000000"/>
                 <w:sz w:val="18"/>
                 <w:szCs w:val="18"/>
@@ -1895,10 +1861,10 @@
           <w:tcPr>
             <w:tcW w:w="2880" w:type="dxa"/>
             <w:tcBorders>
-              <w:top w:val="single" w:color="000000" w:sz="4" w:space="0"/>
-              <w:left w:val="single" w:color="000000" w:sz="4" w:space="0"/>
-              <w:bottom w:val="single" w:color="000000" w:sz="4" w:space="0"/>
-              <w:right w:val="single" w:color="000000" w:sz="4" w:space="0"/>
+              <w:top w:val="single" w:sz="4" w:space="0" w:color="000000"/>
+              <w:left w:val="single" w:sz="4" w:space="0" w:color="000000"/>
+              <w:bottom w:val="single" w:sz="4" w:space="0" w:color="000000"/>
+              <w:right w:val="single" w:sz="4" w:space="0" w:color="000000"/>
             </w:tcBorders>
             <w:tcMar>
               <w:top w:w="80" w:type="dxa"/>
@@ -1925,10 +1891,10 @@
           <w:tcPr>
             <w:tcW w:w="2880" w:type="dxa"/>
             <w:tcBorders>
-              <w:top w:val="single" w:color="000000" w:sz="4" w:space="0"/>
-              <w:left w:val="single" w:color="000000" w:sz="4" w:space="0"/>
-              <w:bottom w:val="single" w:color="000000" w:sz="4" w:space="0"/>
-              <w:right w:val="single" w:color="000000" w:sz="4" w:space="0"/>
+              <w:top w:val="single" w:sz="4" w:space="0" w:color="000000"/>
+              <w:left w:val="single" w:sz="4" w:space="0" w:color="000000"/>
+              <w:bottom w:val="single" w:sz="4" w:space="0" w:color="000000"/>
+              <w:right w:val="single" w:sz="4" w:space="0" w:color="000000"/>
             </w:tcBorders>
             <w:tcMar>
               <w:top w:w="80" w:type="dxa"/>
@@ -1959,10 +1925,10 @@
           <w:tcPr>
             <w:tcW w:w="2880" w:type="dxa"/>
             <w:tcBorders>
-              <w:top w:val="single" w:color="000000" w:sz="4" w:space="0"/>
-              <w:left w:val="single" w:color="000000" w:sz="4" w:space="0"/>
-              <w:bottom w:val="single" w:color="000000" w:sz="4" w:space="0"/>
-              <w:right w:val="single" w:color="000000" w:sz="4" w:space="0"/>
+              <w:top w:val="single" w:sz="4" w:space="0" w:color="000000"/>
+              <w:left w:val="single" w:sz="4" w:space="0" w:color="000000"/>
+              <w:bottom w:val="single" w:sz="4" w:space="0" w:color="000000"/>
+              <w:right w:val="single" w:sz="4" w:space="0" w:color="000000"/>
             </w:tcBorders>
             <w:tcMar>
               <w:top w:w="80" w:type="dxa"/>
@@ -1975,7 +1941,7 @@
             <w:pPr>
               <w:rPr>
                 <w:rStyle w:val="None"/>
-                <w:rFonts w:ascii="Aptos" w:hAnsi="Aptos" w:eastAsia="Aptos" w:cs="Aptos"/>
+                <w:rFonts w:ascii="Aptos" w:eastAsia="Aptos" w:hAnsi="Aptos" w:cs="Aptos"/>
                 <w:color w:val="000000"/>
                 <w:sz w:val="18"/>
                 <w:szCs w:val="18"/>
@@ -1991,7 +1957,7 @@
             <w:r>
               <w:rPr>
                 <w:rStyle w:val="None"/>
-                <w:rFonts w:ascii="Aptos" w:hAnsi="Aptos" w:eastAsia="Aptos" w:cs="Aptos"/>
+                <w:rFonts w:ascii="Aptos" w:eastAsia="Aptos" w:hAnsi="Aptos" w:cs="Aptos"/>
                 <w:color w:val="000000"/>
                 <w:sz w:val="18"/>
                 <w:szCs w:val="18"/>
@@ -2016,10 +1982,10 @@
           <w:tcPr>
             <w:tcW w:w="2880" w:type="dxa"/>
             <w:tcBorders>
-              <w:top w:val="single" w:color="000000" w:sz="4" w:space="0"/>
-              <w:left w:val="single" w:color="000000" w:sz="4" w:space="0"/>
-              <w:bottom w:val="single" w:color="000000" w:sz="4" w:space="0"/>
-              <w:right w:val="single" w:color="000000" w:sz="4" w:space="0"/>
+              <w:top w:val="single" w:sz="4" w:space="0" w:color="000000"/>
+              <w:left w:val="single" w:sz="4" w:space="0" w:color="000000"/>
+              <w:bottom w:val="single" w:sz="4" w:space="0" w:color="000000"/>
+              <w:right w:val="single" w:sz="4" w:space="0" w:color="000000"/>
             </w:tcBorders>
             <w:tcMar>
               <w:top w:w="80" w:type="dxa"/>
@@ -2046,10 +2012,10 @@
           <w:tcPr>
             <w:tcW w:w="2880" w:type="dxa"/>
             <w:tcBorders>
-              <w:top w:val="single" w:color="000000" w:sz="4" w:space="0"/>
-              <w:left w:val="single" w:color="000000" w:sz="4" w:space="0"/>
-              <w:bottom w:val="single" w:color="000000" w:sz="4" w:space="0"/>
-              <w:right w:val="single" w:color="000000" w:sz="4" w:space="0"/>
+              <w:top w:val="single" w:sz="4" w:space="0" w:color="000000"/>
+              <w:left w:val="single" w:sz="4" w:space="0" w:color="000000"/>
+              <w:bottom w:val="single" w:sz="4" w:space="0" w:color="000000"/>
+              <w:right w:val="single" w:sz="4" w:space="0" w:color="000000"/>
             </w:tcBorders>
             <w:tcMar>
               <w:top w:w="80" w:type="dxa"/>
@@ -2073,10 +2039,10 @@
           <w:tcPr>
             <w:tcW w:w="2880" w:type="dxa"/>
             <w:tcBorders>
-              <w:top w:val="single" w:color="000000" w:sz="4" w:space="0"/>
-              <w:left w:val="single" w:color="000000" w:sz="4" w:space="0"/>
-              <w:bottom w:val="single" w:color="000000" w:sz="4" w:space="0"/>
-              <w:right w:val="single" w:color="000000" w:sz="4" w:space="0"/>
+              <w:top w:val="single" w:sz="4" w:space="0" w:color="000000"/>
+              <w:left w:val="single" w:sz="4" w:space="0" w:color="000000"/>
+              <w:bottom w:val="single" w:sz="4" w:space="0" w:color="000000"/>
+              <w:right w:val="single" w:sz="4" w:space="0" w:color="000000"/>
             </w:tcBorders>
             <w:tcMar>
               <w:top w:w="80" w:type="dxa"/>
@@ -2089,7 +2055,7 @@
             <w:pPr>
               <w:rPr>
                 <w:rStyle w:val="None"/>
-                <w:rFonts w:ascii="Aptos" w:hAnsi="Aptos" w:eastAsia="Aptos" w:cs="Aptos"/>
+                <w:rFonts w:ascii="Aptos" w:eastAsia="Aptos" w:hAnsi="Aptos" w:cs="Aptos"/>
                 <w:color w:val="000000"/>
                 <w:sz w:val="18"/>
                 <w:szCs w:val="18"/>
@@ -2113,10 +2079,10 @@
           <w:tcPr>
             <w:tcW w:w="2880" w:type="dxa"/>
             <w:tcBorders>
-              <w:top w:val="single" w:color="000000" w:sz="4" w:space="0"/>
-              <w:left w:val="single" w:color="000000" w:sz="4" w:space="0"/>
-              <w:bottom w:val="single" w:color="000000" w:sz="4" w:space="0"/>
-              <w:right w:val="single" w:color="000000" w:sz="4" w:space="0"/>
+              <w:top w:val="single" w:sz="4" w:space="0" w:color="000000"/>
+              <w:left w:val="single" w:sz="4" w:space="0" w:color="000000"/>
+              <w:bottom w:val="single" w:sz="4" w:space="0" w:color="000000"/>
+              <w:right w:val="single" w:sz="4" w:space="0" w:color="000000"/>
             </w:tcBorders>
             <w:tcMar>
               <w:top w:w="80" w:type="dxa"/>
@@ -2143,10 +2109,10 @@
           <w:tcPr>
             <w:tcW w:w="2880" w:type="dxa"/>
             <w:tcBorders>
-              <w:top w:val="single" w:color="000000" w:sz="4" w:space="0"/>
-              <w:left w:val="single" w:color="000000" w:sz="4" w:space="0"/>
-              <w:bottom w:val="single" w:color="000000" w:sz="4" w:space="0"/>
-              <w:right w:val="single" w:color="000000" w:sz="4" w:space="0"/>
+              <w:top w:val="single" w:sz="4" w:space="0" w:color="000000"/>
+              <w:left w:val="single" w:sz="4" w:space="0" w:color="000000"/>
+              <w:bottom w:val="single" w:sz="4" w:space="0" w:color="000000"/>
+              <w:right w:val="single" w:sz="4" w:space="0" w:color="000000"/>
             </w:tcBorders>
             <w:tcMar>
               <w:top w:w="80" w:type="dxa"/>
@@ -2177,10 +2143,10 @@
           <w:tcPr>
             <w:tcW w:w="2880" w:type="dxa"/>
             <w:tcBorders>
-              <w:top w:val="single" w:color="000000" w:sz="4" w:space="0"/>
-              <w:left w:val="single" w:color="000000" w:sz="4" w:space="0"/>
-              <w:bottom w:val="single" w:color="000000" w:sz="4" w:space="0"/>
-              <w:right w:val="single" w:color="000000" w:sz="4" w:space="0"/>
+              <w:top w:val="single" w:sz="4" w:space="0" w:color="000000"/>
+              <w:left w:val="single" w:sz="4" w:space="0" w:color="000000"/>
+              <w:bottom w:val="single" w:sz="4" w:space="0" w:color="000000"/>
+              <w:right w:val="single" w:sz="4" w:space="0" w:color="000000"/>
             </w:tcBorders>
             <w:tcMar>
               <w:top w:w="80" w:type="dxa"/>
@@ -2193,7 +2159,7 @@
             <w:pPr>
               <w:rPr>
                 <w:rStyle w:val="None"/>
-                <w:rFonts w:ascii="Aptos" w:hAnsi="Aptos" w:eastAsia="Aptos" w:cs="Aptos"/>
+                <w:rFonts w:ascii="Aptos" w:eastAsia="Aptos" w:hAnsi="Aptos" w:cs="Aptos"/>
                 <w:color w:val="000000"/>
                 <w:sz w:val="18"/>
                 <w:szCs w:val="18"/>
@@ -2209,7 +2175,7 @@
             <w:r>
               <w:rPr>
                 <w:rStyle w:val="None"/>
-                <w:rFonts w:ascii="Aptos" w:hAnsi="Aptos" w:eastAsia="Aptos" w:cs="Aptos"/>
+                <w:rFonts w:ascii="Aptos" w:eastAsia="Aptos" w:hAnsi="Aptos" w:cs="Aptos"/>
                 <w:color w:val="000000"/>
                 <w:sz w:val="18"/>
                 <w:szCs w:val="18"/>
@@ -2234,10 +2200,10 @@
           <w:tcPr>
             <w:tcW w:w="2880" w:type="dxa"/>
             <w:tcBorders>
-              <w:top w:val="single" w:color="000000" w:sz="4" w:space="0"/>
-              <w:left w:val="single" w:color="000000" w:sz="4" w:space="0"/>
-              <w:bottom w:val="single" w:color="000000" w:sz="4" w:space="0"/>
-              <w:right w:val="single" w:color="000000" w:sz="4" w:space="0"/>
+              <w:top w:val="single" w:sz="4" w:space="0" w:color="000000"/>
+              <w:left w:val="single" w:sz="4" w:space="0" w:color="000000"/>
+              <w:bottom w:val="single" w:sz="4" w:space="0" w:color="000000"/>
+              <w:right w:val="single" w:sz="4" w:space="0" w:color="000000"/>
             </w:tcBorders>
             <w:tcMar>
               <w:top w:w="80" w:type="dxa"/>
@@ -2264,10 +2230,10 @@
           <w:tcPr>
             <w:tcW w:w="2880" w:type="dxa"/>
             <w:tcBorders>
-              <w:top w:val="single" w:color="000000" w:sz="4" w:space="0"/>
-              <w:left w:val="single" w:color="000000" w:sz="4" w:space="0"/>
-              <w:bottom w:val="single" w:color="000000" w:sz="4" w:space="0"/>
-              <w:right w:val="single" w:color="000000" w:sz="4" w:space="0"/>
+              <w:top w:val="single" w:sz="4" w:space="0" w:color="000000"/>
+              <w:left w:val="single" w:sz="4" w:space="0" w:color="000000"/>
+              <w:bottom w:val="single" w:sz="4" w:space="0" w:color="000000"/>
+              <w:right w:val="single" w:sz="4" w:space="0" w:color="000000"/>
             </w:tcBorders>
             <w:tcMar>
               <w:top w:w="80" w:type="dxa"/>
@@ -2298,10 +2264,10 @@
           <w:tcPr>
             <w:tcW w:w="2880" w:type="dxa"/>
             <w:tcBorders>
-              <w:top w:val="single" w:color="000000" w:sz="4" w:space="0"/>
-              <w:left w:val="single" w:color="000000" w:sz="4" w:space="0"/>
-              <w:bottom w:val="single" w:color="000000" w:sz="4" w:space="0"/>
-              <w:right w:val="single" w:color="000000" w:sz="4" w:space="0"/>
+              <w:top w:val="single" w:sz="4" w:space="0" w:color="000000"/>
+              <w:left w:val="single" w:sz="4" w:space="0" w:color="000000"/>
+              <w:bottom w:val="single" w:sz="4" w:space="0" w:color="000000"/>
+              <w:right w:val="single" w:sz="4" w:space="0" w:color="000000"/>
             </w:tcBorders>
             <w:tcMar>
               <w:top w:w="80" w:type="dxa"/>
@@ -2314,7 +2280,7 @@
             <w:pPr>
               <w:rPr>
                 <w:rStyle w:val="None"/>
-                <w:rFonts w:ascii="Aptos" w:hAnsi="Aptos" w:eastAsia="Aptos" w:cs="Aptos"/>
+                <w:rFonts w:ascii="Aptos" w:eastAsia="Aptos" w:hAnsi="Aptos" w:cs="Aptos"/>
                 <w:color w:val="000000"/>
                 <w:sz w:val="18"/>
                 <w:szCs w:val="18"/>
@@ -2330,7 +2296,7 @@
             <w:r>
               <w:rPr>
                 <w:rStyle w:val="None"/>
-                <w:rFonts w:ascii="Aptos" w:hAnsi="Aptos" w:eastAsia="Aptos" w:cs="Aptos"/>
+                <w:rFonts w:ascii="Aptos" w:eastAsia="Aptos" w:hAnsi="Aptos" w:cs="Aptos"/>
                 <w:color w:val="000000"/>
                 <w:sz w:val="18"/>
                 <w:szCs w:val="18"/>
@@ -2355,10 +2321,10 @@
           <w:tcPr>
             <w:tcW w:w="2880" w:type="dxa"/>
             <w:tcBorders>
-              <w:top w:val="single" w:color="000000" w:sz="4" w:space="0"/>
-              <w:left w:val="single" w:color="000000" w:sz="4" w:space="0"/>
-              <w:bottom w:val="single" w:color="000000" w:sz="4" w:space="0"/>
-              <w:right w:val="single" w:color="000000" w:sz="4" w:space="0"/>
+              <w:top w:val="single" w:sz="4" w:space="0" w:color="000000"/>
+              <w:left w:val="single" w:sz="4" w:space="0" w:color="000000"/>
+              <w:bottom w:val="single" w:sz="4" w:space="0" w:color="000000"/>
+              <w:right w:val="single" w:sz="4" w:space="0" w:color="000000"/>
             </w:tcBorders>
             <w:tcMar>
               <w:top w:w="80" w:type="dxa"/>
@@ -2385,10 +2351,10 @@
           <w:tcPr>
             <w:tcW w:w="2880" w:type="dxa"/>
             <w:tcBorders>
-              <w:top w:val="single" w:color="000000" w:sz="4" w:space="0"/>
-              <w:left w:val="single" w:color="000000" w:sz="4" w:space="0"/>
-              <w:bottom w:val="single" w:color="000000" w:sz="4" w:space="0"/>
-              <w:right w:val="single" w:color="000000" w:sz="4" w:space="0"/>
+              <w:top w:val="single" w:sz="4" w:space="0" w:color="000000"/>
+              <w:left w:val="single" w:sz="4" w:space="0" w:color="000000"/>
+              <w:bottom w:val="single" w:sz="4" w:space="0" w:color="000000"/>
+              <w:right w:val="single" w:sz="4" w:space="0" w:color="000000"/>
             </w:tcBorders>
             <w:tcMar>
               <w:top w:w="80" w:type="dxa"/>
@@ -2419,10 +2385,10 @@
           <w:tcPr>
             <w:tcW w:w="2880" w:type="dxa"/>
             <w:tcBorders>
-              <w:top w:val="single" w:color="000000" w:sz="4" w:space="0"/>
-              <w:left w:val="single" w:color="000000" w:sz="4" w:space="0"/>
-              <w:bottom w:val="single" w:color="000000" w:sz="4" w:space="0"/>
-              <w:right w:val="single" w:color="000000" w:sz="4" w:space="0"/>
+              <w:top w:val="single" w:sz="4" w:space="0" w:color="000000"/>
+              <w:left w:val="single" w:sz="4" w:space="0" w:color="000000"/>
+              <w:bottom w:val="single" w:sz="4" w:space="0" w:color="000000"/>
+              <w:right w:val="single" w:sz="4" w:space="0" w:color="000000"/>
             </w:tcBorders>
             <w:tcMar>
               <w:top w:w="80" w:type="dxa"/>
@@ -2435,7 +2401,7 @@
             <w:pPr>
               <w:rPr>
                 <w:rStyle w:val="None"/>
-                <w:rFonts w:ascii="Aptos" w:hAnsi="Aptos" w:eastAsia="Aptos" w:cs="Aptos"/>
+                <w:rFonts w:ascii="Aptos" w:eastAsia="Aptos" w:hAnsi="Aptos" w:cs="Aptos"/>
                 <w:color w:val="000000"/>
                 <w:sz w:val="18"/>
                 <w:szCs w:val="18"/>
@@ -2451,7 +2417,7 @@
             <w:r>
               <w:rPr>
                 <w:rStyle w:val="None"/>
-                <w:rFonts w:ascii="Aptos" w:hAnsi="Aptos" w:eastAsia="Aptos" w:cs="Aptos"/>
+                <w:rFonts w:ascii="Aptos" w:eastAsia="Aptos" w:hAnsi="Aptos" w:cs="Aptos"/>
                 <w:color w:val="000000"/>
                 <w:sz w:val="18"/>
                 <w:szCs w:val="18"/>
@@ -2476,10 +2442,10 @@
           <w:tcPr>
             <w:tcW w:w="2880" w:type="dxa"/>
             <w:tcBorders>
-              <w:top w:val="single" w:color="000000" w:sz="4" w:space="0"/>
-              <w:left w:val="single" w:color="000000" w:sz="4" w:space="0"/>
-              <w:bottom w:val="single" w:color="000000" w:sz="4" w:space="0"/>
-              <w:right w:val="single" w:color="000000" w:sz="4" w:space="0"/>
+              <w:top w:val="single" w:sz="4" w:space="0" w:color="000000"/>
+              <w:left w:val="single" w:sz="4" w:space="0" w:color="000000"/>
+              <w:bottom w:val="single" w:sz="4" w:space="0" w:color="000000"/>
+              <w:right w:val="single" w:sz="4" w:space="0" w:color="000000"/>
             </w:tcBorders>
             <w:tcMar>
               <w:top w:w="80" w:type="dxa"/>
@@ -2506,10 +2472,10 @@
           <w:tcPr>
             <w:tcW w:w="2880" w:type="dxa"/>
             <w:tcBorders>
-              <w:top w:val="single" w:color="000000" w:sz="4" w:space="0"/>
-              <w:left w:val="single" w:color="000000" w:sz="4" w:space="0"/>
-              <w:bottom w:val="single" w:color="000000" w:sz="4" w:space="0"/>
-              <w:right w:val="single" w:color="000000" w:sz="4" w:space="0"/>
+              <w:top w:val="single" w:sz="4" w:space="0" w:color="000000"/>
+              <w:left w:val="single" w:sz="4" w:space="0" w:color="000000"/>
+              <w:bottom w:val="single" w:sz="4" w:space="0" w:color="000000"/>
+              <w:right w:val="single" w:sz="4" w:space="0" w:color="000000"/>
             </w:tcBorders>
             <w:tcMar>
               <w:top w:w="80" w:type="dxa"/>
@@ -2524,10 +2490,10 @@
           <w:tcPr>
             <w:tcW w:w="2880" w:type="dxa"/>
             <w:tcBorders>
-              <w:top w:val="single" w:color="000000" w:sz="4" w:space="0"/>
-              <w:left w:val="single" w:color="000000" w:sz="4" w:space="0"/>
-              <w:bottom w:val="single" w:color="000000" w:sz="4" w:space="0"/>
-              <w:right w:val="single" w:color="000000" w:sz="4" w:space="0"/>
+              <w:top w:val="single" w:sz="4" w:space="0" w:color="000000"/>
+              <w:left w:val="single" w:sz="4" w:space="0" w:color="000000"/>
+              <w:bottom w:val="single" w:sz="4" w:space="0" w:color="000000"/>
+              <w:right w:val="single" w:sz="4" w:space="0" w:color="000000"/>
             </w:tcBorders>
             <w:tcMar>
               <w:top w:w="80" w:type="dxa"/>
@@ -2607,12 +2573,12 @@
         <w:tblW w:w="8640" w:type="dxa"/>
         <w:tblInd w:w="216" w:type="dxa"/>
         <w:tblBorders>
-          <w:top w:val="single" w:color="FFFFFF" w:sz="8" w:space="0"/>
-          <w:left w:val="single" w:color="FFFFFF" w:sz="8" w:space="0"/>
-          <w:bottom w:val="single" w:color="FFFFFF" w:sz="8" w:space="0"/>
-          <w:right w:val="single" w:color="FFFFFF" w:sz="8" w:space="0"/>
-          <w:insideH w:val="single" w:color="FFFFFF" w:sz="8" w:space="0"/>
-          <w:insideV w:val="single" w:color="FFFFFF" w:sz="8" w:space="0"/>
+          <w:top w:val="single" w:sz="8" w:space="0" w:color="FFFFFF"/>
+          <w:left w:val="single" w:sz="8" w:space="0" w:color="FFFFFF"/>
+          <w:bottom w:val="single" w:sz="8" w:space="0" w:color="FFFFFF"/>
+          <w:right w:val="single" w:sz="8" w:space="0" w:color="FFFFFF"/>
+          <w:insideH w:val="single" w:sz="8" w:space="0" w:color="FFFFFF"/>
+          <w:insideV w:val="single" w:sz="8" w:space="0" w:color="FFFFFF"/>
         </w:tblBorders>
         <w:shd w:val="clear" w:color="auto" w:fill="CED7E7"/>
         <w:tblLayout w:type="fixed"/>
@@ -2631,10 +2597,10 @@
           <w:tcPr>
             <w:tcW w:w="2880" w:type="dxa"/>
             <w:tcBorders>
-              <w:top w:val="single" w:color="000000" w:sz="4" w:space="0"/>
-              <w:left w:val="single" w:color="000000" w:sz="4" w:space="0"/>
-              <w:bottom w:val="single" w:color="000000" w:sz="4" w:space="0"/>
-              <w:right w:val="single" w:color="000000" w:sz="4" w:space="0"/>
+              <w:top w:val="single" w:sz="4" w:space="0" w:color="000000"/>
+              <w:left w:val="single" w:sz="4" w:space="0" w:color="000000"/>
+              <w:bottom w:val="single" w:sz="4" w:space="0" w:color="000000"/>
+              <w:right w:val="single" w:sz="4" w:space="0" w:color="000000"/>
             </w:tcBorders>
             <w:tcMar>
               <w:top w:w="80" w:type="dxa"/>
@@ -2660,10 +2626,10 @@
           <w:tcPr>
             <w:tcW w:w="2880" w:type="dxa"/>
             <w:tcBorders>
-              <w:top w:val="single" w:color="000000" w:sz="4" w:space="0"/>
-              <w:left w:val="single" w:color="000000" w:sz="4" w:space="0"/>
-              <w:bottom w:val="single" w:color="000000" w:sz="4" w:space="0"/>
-              <w:right w:val="single" w:color="000000" w:sz="4" w:space="0"/>
+              <w:top w:val="single" w:sz="4" w:space="0" w:color="000000"/>
+              <w:left w:val="single" w:sz="4" w:space="0" w:color="000000"/>
+              <w:bottom w:val="single" w:sz="4" w:space="0" w:color="000000"/>
+              <w:right w:val="single" w:sz="4" w:space="0" w:color="000000"/>
             </w:tcBorders>
             <w:tcMar>
               <w:top w:w="80" w:type="dxa"/>
@@ -2690,10 +2656,10 @@
           <w:tcPr>
             <w:tcW w:w="2880" w:type="dxa"/>
             <w:tcBorders>
-              <w:top w:val="single" w:color="000000" w:sz="4" w:space="0"/>
-              <w:left w:val="single" w:color="000000" w:sz="4" w:space="0"/>
-              <w:bottom w:val="single" w:color="000000" w:sz="4" w:space="0"/>
-              <w:right w:val="single" w:color="000000" w:sz="4" w:space="0"/>
+              <w:top w:val="single" w:sz="4" w:space="0" w:color="000000"/>
+              <w:left w:val="single" w:sz="4" w:space="0" w:color="000000"/>
+              <w:bottom w:val="single" w:sz="4" w:space="0" w:color="000000"/>
+              <w:right w:val="single" w:sz="4" w:space="0" w:color="000000"/>
             </w:tcBorders>
             <w:tcMar>
               <w:top w:w="80" w:type="dxa"/>
@@ -2725,10 +2691,10 @@
           <w:tcPr>
             <w:tcW w:w="2880" w:type="dxa"/>
             <w:tcBorders>
-              <w:top w:val="single" w:color="000000" w:sz="4" w:space="0"/>
-              <w:left w:val="single" w:color="000000" w:sz="4" w:space="0"/>
-              <w:bottom w:val="single" w:color="000000" w:sz="4" w:space="0"/>
-              <w:right w:val="single" w:color="000000" w:sz="4" w:space="0"/>
+              <w:top w:val="single" w:sz="4" w:space="0" w:color="000000"/>
+              <w:left w:val="single" w:sz="4" w:space="0" w:color="000000"/>
+              <w:bottom w:val="single" w:sz="4" w:space="0" w:color="000000"/>
+              <w:right w:val="single" w:sz="4" w:space="0" w:color="000000"/>
             </w:tcBorders>
             <w:tcMar>
               <w:top w:w="80" w:type="dxa"/>
@@ -2755,10 +2721,10 @@
           <w:tcPr>
             <w:tcW w:w="2880" w:type="dxa"/>
             <w:tcBorders>
-              <w:top w:val="single" w:color="000000" w:sz="4" w:space="0"/>
-              <w:left w:val="single" w:color="000000" w:sz="4" w:space="0"/>
-              <w:bottom w:val="single" w:color="000000" w:sz="4" w:space="0"/>
-              <w:right w:val="single" w:color="000000" w:sz="4" w:space="0"/>
+              <w:top w:val="single" w:sz="4" w:space="0" w:color="000000"/>
+              <w:left w:val="single" w:sz="4" w:space="0" w:color="000000"/>
+              <w:bottom w:val="single" w:sz="4" w:space="0" w:color="000000"/>
+              <w:right w:val="single" w:sz="4" w:space="0" w:color="000000"/>
             </w:tcBorders>
             <w:tcMar>
               <w:top w:w="80" w:type="dxa"/>
@@ -2771,7 +2737,7 @@
             <w:pPr>
               <w:rPr>
                 <w:rStyle w:val="None"/>
-                <w:rFonts w:ascii="Aptos" w:hAnsi="Aptos" w:eastAsia="Aptos" w:cs="Aptos"/>
+                <w:rFonts w:ascii="Aptos" w:eastAsia="Aptos" w:hAnsi="Aptos" w:cs="Aptos"/>
                 <w:color w:val="000000"/>
                 <w:sz w:val="18"/>
                 <w:szCs w:val="18"/>
@@ -2790,10 +2756,10 @@
           <w:tcPr>
             <w:tcW w:w="2880" w:type="dxa"/>
             <w:tcBorders>
-              <w:top w:val="single" w:color="000000" w:sz="4" w:space="0"/>
-              <w:left w:val="single" w:color="000000" w:sz="4" w:space="0"/>
-              <w:bottom w:val="single" w:color="000000" w:sz="4" w:space="0"/>
-              <w:right w:val="single" w:color="000000" w:sz="4" w:space="0"/>
+              <w:top w:val="single" w:sz="4" w:space="0" w:color="000000"/>
+              <w:left w:val="single" w:sz="4" w:space="0" w:color="000000"/>
+              <w:bottom w:val="single" w:sz="4" w:space="0" w:color="000000"/>
+              <w:right w:val="single" w:sz="4" w:space="0" w:color="000000"/>
             </w:tcBorders>
             <w:tcMar>
               <w:top w:w="80" w:type="dxa"/>
@@ -2813,10 +2779,10 @@
           <w:tcPr>
             <w:tcW w:w="2880" w:type="dxa"/>
             <w:tcBorders>
-              <w:top w:val="single" w:color="000000" w:sz="4" w:space="0"/>
-              <w:left w:val="single" w:color="000000" w:sz="4" w:space="0"/>
-              <w:bottom w:val="single" w:color="000000" w:sz="4" w:space="0"/>
-              <w:right w:val="single" w:color="000000" w:sz="4" w:space="0"/>
+              <w:top w:val="single" w:sz="4" w:space="0" w:color="000000"/>
+              <w:left w:val="single" w:sz="4" w:space="0" w:color="000000"/>
+              <w:bottom w:val="single" w:sz="4" w:space="0" w:color="000000"/>
+              <w:right w:val="single" w:sz="4" w:space="0" w:color="000000"/>
             </w:tcBorders>
             <w:tcMar>
               <w:top w:w="80" w:type="dxa"/>
@@ -2843,10 +2809,10 @@
           <w:tcPr>
             <w:tcW w:w="2880" w:type="dxa"/>
             <w:tcBorders>
-              <w:top w:val="single" w:color="000000" w:sz="4" w:space="0"/>
-              <w:left w:val="single" w:color="000000" w:sz="4" w:space="0"/>
-              <w:bottom w:val="single" w:color="000000" w:sz="4" w:space="0"/>
-              <w:right w:val="single" w:color="000000" w:sz="4" w:space="0"/>
+              <w:top w:val="single" w:sz="4" w:space="0" w:color="000000"/>
+              <w:left w:val="single" w:sz="4" w:space="0" w:color="000000"/>
+              <w:bottom w:val="single" w:sz="4" w:space="0" w:color="000000"/>
+              <w:right w:val="single" w:sz="4" w:space="0" w:color="000000"/>
             </w:tcBorders>
             <w:tcMar>
               <w:top w:w="80" w:type="dxa"/>
@@ -2860,7 +2826,7 @@
               <w:pStyle w:val="Body"/>
               <w:rPr>
                 <w:rStyle w:val="None"/>
-                <w:rFonts w:ascii="Aptos" w:hAnsi="Aptos" w:eastAsia="Aptos" w:cs="Aptos"/>
+                <w:rFonts w:ascii="Aptos" w:eastAsia="Aptos" w:hAnsi="Aptos" w:cs="Aptos"/>
                 <w:sz w:val="18"/>
                 <w:szCs w:val="18"/>
                 <w14:textOutline w14:w="12700" w14:cap="flat" w14:cmpd="sng" w14:algn="ctr">
@@ -2873,7 +2839,7 @@
             <w:r>
               <w:rPr>
                 <w:rStyle w:val="None"/>
-                <w:rFonts w:ascii="Aptos" w:hAnsi="Aptos" w:eastAsia="Aptos" w:cs="Aptos"/>
+                <w:rFonts w:ascii="Aptos" w:eastAsia="Aptos" w:hAnsi="Aptos" w:cs="Aptos"/>
                 <w:sz w:val="18"/>
                 <w:szCs w:val="18"/>
                 <w14:textOutline w14:w="12700" w14:cap="flat" w14:cmpd="sng" w14:algn="ctr">
@@ -2890,10 +2856,10 @@
           <w:tcPr>
             <w:tcW w:w="2880" w:type="dxa"/>
             <w:tcBorders>
-              <w:top w:val="single" w:color="000000" w:sz="4" w:space="0"/>
-              <w:left w:val="single" w:color="000000" w:sz="4" w:space="0"/>
-              <w:bottom w:val="single" w:color="000000" w:sz="4" w:space="0"/>
-              <w:right w:val="single" w:color="000000" w:sz="4" w:space="0"/>
+              <w:top w:val="single" w:sz="4" w:space="0" w:color="000000"/>
+              <w:left w:val="single" w:sz="4" w:space="0" w:color="000000"/>
+              <w:bottom w:val="single" w:sz="4" w:space="0" w:color="000000"/>
+              <w:right w:val="single" w:sz="4" w:space="0" w:color="000000"/>
             </w:tcBorders>
             <w:tcMar>
               <w:top w:w="80" w:type="dxa"/>
@@ -2909,7 +2875,7 @@
             <w:r>
               <w:rPr>
                 <w:rStyle w:val="None"/>
-                <w:rFonts w:ascii="Aptos" w:hAnsi="Aptos" w:eastAsia="Aptos" w:cs="Aptos"/>
+                <w:rFonts w:ascii="Aptos" w:eastAsia="Aptos" w:hAnsi="Aptos" w:cs="Aptos"/>
                 <w:sz w:val="18"/>
                 <w:szCs w:val="18"/>
                 <w14:textOutline w14:w="12700" w14:cap="flat" w14:cmpd="sng" w14:algn="ctr">
@@ -2931,10 +2897,10 @@
           <w:tcPr>
             <w:tcW w:w="2880" w:type="dxa"/>
             <w:tcBorders>
-              <w:top w:val="single" w:color="000000" w:sz="4" w:space="0"/>
-              <w:left w:val="single" w:color="000000" w:sz="4" w:space="0"/>
-              <w:bottom w:val="single" w:color="000000" w:sz="4" w:space="0"/>
-              <w:right w:val="single" w:color="000000" w:sz="4" w:space="0"/>
+              <w:top w:val="single" w:sz="4" w:space="0" w:color="000000"/>
+              <w:left w:val="single" w:sz="4" w:space="0" w:color="000000"/>
+              <w:bottom w:val="single" w:sz="4" w:space="0" w:color="000000"/>
+              <w:right w:val="single" w:sz="4" w:space="0" w:color="000000"/>
             </w:tcBorders>
             <w:tcMar>
               <w:top w:w="80" w:type="dxa"/>
@@ -2961,10 +2927,10 @@
           <w:tcPr>
             <w:tcW w:w="2880" w:type="dxa"/>
             <w:tcBorders>
-              <w:top w:val="single" w:color="000000" w:sz="4" w:space="0"/>
-              <w:left w:val="single" w:color="000000" w:sz="4" w:space="0"/>
-              <w:bottom w:val="single" w:color="000000" w:sz="4" w:space="0"/>
-              <w:right w:val="single" w:color="000000" w:sz="4" w:space="0"/>
+              <w:top w:val="single" w:sz="4" w:space="0" w:color="000000"/>
+              <w:left w:val="single" w:sz="4" w:space="0" w:color="000000"/>
+              <w:bottom w:val="single" w:sz="4" w:space="0" w:color="000000"/>
+              <w:right w:val="single" w:sz="4" w:space="0" w:color="000000"/>
             </w:tcBorders>
             <w:tcMar>
               <w:top w:w="80" w:type="dxa"/>
@@ -2988,10 +2954,10 @@
           <w:tcPr>
             <w:tcW w:w="2880" w:type="dxa"/>
             <w:tcBorders>
-              <w:top w:val="single" w:color="000000" w:sz="4" w:space="0"/>
-              <w:left w:val="single" w:color="000000" w:sz="4" w:space="0"/>
-              <w:bottom w:val="single" w:color="000000" w:sz="4" w:space="0"/>
-              <w:right w:val="single" w:color="000000" w:sz="4" w:space="0"/>
+              <w:top w:val="single" w:sz="4" w:space="0" w:color="000000"/>
+              <w:left w:val="single" w:sz="4" w:space="0" w:color="000000"/>
+              <w:bottom w:val="single" w:sz="4" w:space="0" w:color="000000"/>
+              <w:right w:val="single" w:sz="4" w:space="0" w:color="000000"/>
             </w:tcBorders>
             <w:tcMar>
               <w:top w:w="80" w:type="dxa"/>
@@ -3016,10 +2982,10 @@
           <w:tcPr>
             <w:tcW w:w="2880" w:type="dxa"/>
             <w:tcBorders>
-              <w:top w:val="single" w:color="000000" w:sz="4" w:space="0"/>
-              <w:left w:val="single" w:color="000000" w:sz="4" w:space="0"/>
-              <w:bottom w:val="single" w:color="000000" w:sz="4" w:space="0"/>
-              <w:right w:val="single" w:color="000000" w:sz="4" w:space="0"/>
+              <w:top w:val="single" w:sz="4" w:space="0" w:color="000000"/>
+              <w:left w:val="single" w:sz="4" w:space="0" w:color="000000"/>
+              <w:bottom w:val="single" w:sz="4" w:space="0" w:color="000000"/>
+              <w:right w:val="single" w:sz="4" w:space="0" w:color="000000"/>
             </w:tcBorders>
             <w:tcMar>
               <w:top w:w="80" w:type="dxa"/>
@@ -3046,10 +3012,10 @@
           <w:tcPr>
             <w:tcW w:w="2880" w:type="dxa"/>
             <w:tcBorders>
-              <w:top w:val="single" w:color="000000" w:sz="4" w:space="0"/>
-              <w:left w:val="single" w:color="000000" w:sz="4" w:space="0"/>
-              <w:bottom w:val="single" w:color="000000" w:sz="4" w:space="0"/>
-              <w:right w:val="single" w:color="000000" w:sz="4" w:space="0"/>
+              <w:top w:val="single" w:sz="4" w:space="0" w:color="000000"/>
+              <w:left w:val="single" w:sz="4" w:space="0" w:color="000000"/>
+              <w:bottom w:val="single" w:sz="4" w:space="0" w:color="000000"/>
+              <w:right w:val="single" w:sz="4" w:space="0" w:color="000000"/>
             </w:tcBorders>
             <w:tcMar>
               <w:top w:w="80" w:type="dxa"/>
@@ -3080,10 +3046,10 @@
           <w:tcPr>
             <w:tcW w:w="2880" w:type="dxa"/>
             <w:tcBorders>
-              <w:top w:val="single" w:color="000000" w:sz="4" w:space="0"/>
-              <w:left w:val="single" w:color="000000" w:sz="4" w:space="0"/>
-              <w:bottom w:val="single" w:color="000000" w:sz="4" w:space="0"/>
-              <w:right w:val="single" w:color="000000" w:sz="4" w:space="0"/>
+              <w:top w:val="single" w:sz="4" w:space="0" w:color="000000"/>
+              <w:left w:val="single" w:sz="4" w:space="0" w:color="000000"/>
+              <w:bottom w:val="single" w:sz="4" w:space="0" w:color="000000"/>
+              <w:right w:val="single" w:sz="4" w:space="0" w:color="000000"/>
             </w:tcBorders>
             <w:tcMar>
               <w:top w:w="80" w:type="dxa"/>
@@ -3115,10 +3081,10 @@
           <w:tcPr>
             <w:tcW w:w="2880" w:type="dxa"/>
             <w:tcBorders>
-              <w:top w:val="single" w:color="000000" w:sz="4" w:space="0"/>
-              <w:left w:val="single" w:color="000000" w:sz="4" w:space="0"/>
-              <w:bottom w:val="single" w:color="000000" w:sz="4" w:space="0"/>
-              <w:right w:val="single" w:color="000000" w:sz="4" w:space="0"/>
+              <w:top w:val="single" w:sz="4" w:space="0" w:color="000000"/>
+              <w:left w:val="single" w:sz="4" w:space="0" w:color="000000"/>
+              <w:bottom w:val="single" w:sz="4" w:space="0" w:color="000000"/>
+              <w:right w:val="single" w:sz="4" w:space="0" w:color="000000"/>
             </w:tcBorders>
             <w:tcMar>
               <w:top w:w="80" w:type="dxa"/>
@@ -3145,10 +3111,10 @@
           <w:tcPr>
             <w:tcW w:w="2880" w:type="dxa"/>
             <w:tcBorders>
-              <w:top w:val="single" w:color="000000" w:sz="4" w:space="0"/>
-              <w:left w:val="single" w:color="000000" w:sz="4" w:space="0"/>
-              <w:bottom w:val="single" w:color="000000" w:sz="4" w:space="0"/>
-              <w:right w:val="single" w:color="000000" w:sz="4" w:space="0"/>
+              <w:top w:val="single" w:sz="4" w:space="0" w:color="000000"/>
+              <w:left w:val="single" w:sz="4" w:space="0" w:color="000000"/>
+              <w:bottom w:val="single" w:sz="4" w:space="0" w:color="000000"/>
+              <w:right w:val="single" w:sz="4" w:space="0" w:color="000000"/>
             </w:tcBorders>
             <w:tcMar>
               <w:top w:w="80" w:type="dxa"/>
@@ -3161,7 +3127,7 @@
             <w:pPr>
               <w:rPr>
                 <w:rStyle w:val="None"/>
-                <w:rFonts w:ascii="Aptos" w:hAnsi="Aptos" w:eastAsia="Aptos" w:cs="Aptos"/>
+                <w:rFonts w:ascii="Aptos" w:eastAsia="Aptos" w:hAnsi="Aptos" w:cs="Aptos"/>
                 <w:color w:val="000000"/>
                 <w:sz w:val="18"/>
                 <w:szCs w:val="18"/>
@@ -3177,7 +3143,7 @@
             <w:r>
               <w:rPr>
                 <w:rStyle w:val="None"/>
-                <w:rFonts w:ascii="Aptos" w:hAnsi="Aptos" w:eastAsia="Aptos" w:cs="Aptos"/>
+                <w:rFonts w:ascii="Aptos" w:eastAsia="Aptos" w:hAnsi="Aptos" w:cs="Aptos"/>
                 <w:color w:val="000000"/>
                 <w:sz w:val="18"/>
                 <w:szCs w:val="18"/>
@@ -3197,10 +3163,10 @@
           <w:tcPr>
             <w:tcW w:w="2880" w:type="dxa"/>
             <w:tcBorders>
-              <w:top w:val="single" w:color="000000" w:sz="4" w:space="0"/>
-              <w:left w:val="single" w:color="000000" w:sz="4" w:space="0"/>
-              <w:bottom w:val="single" w:color="000000" w:sz="4" w:space="0"/>
-              <w:right w:val="single" w:color="000000" w:sz="4" w:space="0"/>
+              <w:top w:val="single" w:sz="4" w:space="0" w:color="000000"/>
+              <w:left w:val="single" w:sz="4" w:space="0" w:color="000000"/>
+              <w:bottom w:val="single" w:sz="4" w:space="0" w:color="000000"/>
+              <w:right w:val="single" w:sz="4" w:space="0" w:color="000000"/>
             </w:tcBorders>
             <w:tcMar>
               <w:top w:w="80" w:type="dxa"/>
@@ -3232,10 +3198,10 @@
           <w:tcPr>
             <w:tcW w:w="2880" w:type="dxa"/>
             <w:tcBorders>
-              <w:top w:val="single" w:color="000000" w:sz="4" w:space="0"/>
-              <w:left w:val="single" w:color="000000" w:sz="4" w:space="0"/>
-              <w:bottom w:val="single" w:color="000000" w:sz="4" w:space="0"/>
-              <w:right w:val="single" w:color="000000" w:sz="4" w:space="0"/>
+              <w:top w:val="single" w:sz="4" w:space="0" w:color="000000"/>
+              <w:left w:val="single" w:sz="4" w:space="0" w:color="000000"/>
+              <w:bottom w:val="single" w:sz="4" w:space="0" w:color="000000"/>
+              <w:right w:val="single" w:sz="4" w:space="0" w:color="000000"/>
             </w:tcBorders>
             <w:tcMar>
               <w:top w:w="80" w:type="dxa"/>
@@ -3262,10 +3228,10 @@
           <w:tcPr>
             <w:tcW w:w="2880" w:type="dxa"/>
             <w:tcBorders>
-              <w:top w:val="single" w:color="000000" w:sz="4" w:space="0"/>
-              <w:left w:val="single" w:color="000000" w:sz="4" w:space="0"/>
-              <w:bottom w:val="single" w:color="000000" w:sz="4" w:space="0"/>
-              <w:right w:val="single" w:color="000000" w:sz="4" w:space="0"/>
+              <w:top w:val="single" w:sz="4" w:space="0" w:color="000000"/>
+              <w:left w:val="single" w:sz="4" w:space="0" w:color="000000"/>
+              <w:bottom w:val="single" w:sz="4" w:space="0" w:color="000000"/>
+              <w:right w:val="single" w:sz="4" w:space="0" w:color="000000"/>
             </w:tcBorders>
             <w:tcMar>
               <w:top w:w="80" w:type="dxa"/>
@@ -3278,7 +3244,7 @@
             <w:pPr>
               <w:rPr>
                 <w:rStyle w:val="None"/>
-                <w:rFonts w:ascii="Aptos" w:hAnsi="Aptos" w:eastAsia="Aptos" w:cs="Aptos"/>
+                <w:rFonts w:ascii="Aptos" w:eastAsia="Aptos" w:hAnsi="Aptos" w:cs="Aptos"/>
                 <w:color w:val="000000"/>
                 <w:sz w:val="18"/>
                 <w:szCs w:val="18"/>
@@ -3294,7 +3260,7 @@
             <w:r>
               <w:rPr>
                 <w:rStyle w:val="None"/>
-                <w:rFonts w:ascii="Aptos" w:hAnsi="Aptos" w:eastAsia="Aptos" w:cs="Aptos"/>
+                <w:rFonts w:ascii="Aptos" w:eastAsia="Aptos" w:hAnsi="Aptos" w:cs="Aptos"/>
                 <w:color w:val="000000"/>
                 <w:sz w:val="18"/>
                 <w:szCs w:val="18"/>
@@ -3314,10 +3280,10 @@
           <w:tcPr>
             <w:tcW w:w="2880" w:type="dxa"/>
             <w:tcBorders>
-              <w:top w:val="single" w:color="000000" w:sz="4" w:space="0"/>
-              <w:left w:val="single" w:color="000000" w:sz="4" w:space="0"/>
-              <w:bottom w:val="single" w:color="000000" w:sz="4" w:space="0"/>
-              <w:right w:val="single" w:color="000000" w:sz="4" w:space="0"/>
+              <w:top w:val="single" w:sz="4" w:space="0" w:color="000000"/>
+              <w:left w:val="single" w:sz="4" w:space="0" w:color="000000"/>
+              <w:bottom w:val="single" w:sz="4" w:space="0" w:color="000000"/>
+              <w:right w:val="single" w:sz="4" w:space="0" w:color="000000"/>
             </w:tcBorders>
             <w:tcMar>
               <w:top w:w="80" w:type="dxa"/>
@@ -3351,9 +3317,9 @@
       </w:pPr>
     </w:p>
     <w:sectPr>
-      <w:headerReference w:type="default" r:id="rId8"/>
-      <w:footerReference w:type="default" r:id="rId9"/>
-      <w:pgSz w:w="12240" w:h="15840" w:orient="portrait"/>
+      <w:headerReference w:type="default" r:id="rId9"/>
+      <w:footerReference w:type="default" r:id="rId10"/>
+      <w:pgSz w:w="12240" w:h="15840"/>
       <w:pgMar w:top="936" w:right="1800" w:bottom="936" w:left="1800" w:header="720" w:footer="720" w:gutter="0"/>
       <w:cols w:space="720"/>
     </w:sectPr>
@@ -3420,25 +3386,183 @@
 </file>
 
 <file path=word/intelligence2.xml><?xml version="1.0" encoding="utf-8"?>
-<int2:intelligence xmlns:int2="http://schemas.microsoft.com/office/intelligence/2020/intelligence">
+<int2:intelligence xmlns:int2="http://schemas.microsoft.com/office/intelligence/2020/intelligence" xmlns:oel="http://schemas.microsoft.com/office/2019/extlst">
   <int2:observations>
     <int2:textHash int2:hashCode="qK79WZd0OLs4TF" int2:id="tVDuQqdU">
-      <int2:state int2:type="spell" int2:value="Rejected"/>
+      <int2:state int2:value="Rejected" int2:type="spell"/>
     </int2:textHash>
     <int2:textHash int2:hashCode="m7yhQvXidPhEKe" int2:id="84RzbGLD">
-      <int2:state int2:type="spell" int2:value="Rejected"/>
+      <int2:state int2:value="Rejected" int2:type="spell"/>
     </int2:textHash>
   </int2:observations>
   <int2:intelligenceSettings/>
+  <int2:onDemandWorkflows/>
 </int2:intelligence>
 </file>
 
+<file path=word/numbering.xml><?xml version="1.0" encoding="utf-8"?>
+<w:numbering xmlns:wpc="http://schemas.microsoft.com/office/word/2010/wordprocessingCanvas" xmlns:cx="http://schemas.microsoft.com/office/drawing/2014/chartex" xmlns:cx1="http://schemas.microsoft.com/office/drawing/2015/9/8/chartex" xmlns:cx2="http://schemas.microsoft.com/office/drawing/2015/10/21/chartex" xmlns:cx3="http://schemas.microsoft.com/office/drawing/2016/5/9/chartex" xmlns:cx4="http://schemas.microsoft.com/office/drawing/2016/5/10/chartex" xmlns:cx5="http://schemas.microsoft.com/office/drawing/2016/5/11/chartex" xmlns:cx6="http://schemas.microsoft.com/office/drawing/2016/5/12/chartex" xmlns:cx7="http://schemas.microsoft.com/office/drawing/2016/5/13/chartex" xmlns:cx8="http://schemas.microsoft.com/office/drawing/2016/5/14/chartex" xmlns:mc="http://schemas.openxmlformats.org/markup-compatibility/2006" xmlns:aink="http://schemas.microsoft.com/office/drawing/2016/ink" xmlns:am3d="http://schemas.microsoft.com/office/drawing/2017/model3d" xmlns:o="urn:schemas-microsoft-com:office:office" xmlns:oel="http://schemas.microsoft.com/office/2019/extlst" xmlns:r="http://schemas.openxmlformats.org/officeDocument/2006/relationships" xmlns:m="http://schemas.openxmlformats.org/officeDocument/2006/math" xmlns:v="urn:schemas-microsoft-com:vml" xmlns:wp14="http://schemas.microsoft.com/office/word/2010/wordprocessingDrawing" xmlns:wp="http://schemas.openxmlformats.org/drawingml/2006/wordprocessingDrawing" xmlns:w10="urn:schemas-microsoft-com:office:word" xmlns:w="http://schemas.openxmlformats.org/wordprocessingml/2006/main" xmlns:w14="http://schemas.microsoft.com/office/word/2010/wordml" xmlns:w15="http://schemas.microsoft.com/office/word/2012/wordml" xmlns:w16cex="http://schemas.microsoft.com/office/word/2018/wordml/cex" xmlns:w16cid="http://schemas.microsoft.com/office/word/2016/wordml/cid" xmlns:w16="http://schemas.microsoft.com/office/word/2018/wordml" xmlns:w16du="http://schemas.microsoft.com/office/word/2023/wordml/word16du" xmlns:w16sdtdh="http://schemas.microsoft.com/office/word/2020/wordml/sdtdatahash" xmlns:w16sdtfl="http://schemas.microsoft.com/office/word/2024/wordml/sdtformatlock" xmlns:w16se="http://schemas.microsoft.com/office/word/2015/wordml/symex" xmlns:wpg="http://schemas.microsoft.com/office/word/2010/wordprocessingGroup" xmlns:wpi="http://schemas.microsoft.com/office/word/2010/wordprocessingInk" xmlns:wne="http://schemas.microsoft.com/office/word/2006/wordml" xmlns:wps="http://schemas.microsoft.com/office/word/2010/wordprocessingShape" mc:Ignorable="w14 w15 w16se w16cid w16 w16cex w16sdtdh w16sdtfl w16du wp14">
+  <w:abstractNum w:abstractNumId="0" w15:restartNumberingAfterBreak="0">
+    <w:nsid w:val="7E0C6DC5"/>
+    <w:multiLevelType w:val="multilevel"/>
+    <w:tmpl w:val="C8D667C6"/>
+    <w:lvl w:ilvl="0">
+      <w:start w:val="1"/>
+      <w:numFmt w:val="bullet"/>
+      <w:lvlText w:val=""/>
+      <w:lvlJc w:val="left"/>
+      <w:pPr>
+        <w:tabs>
+          <w:tab w:val="num" w:pos="720"/>
+        </w:tabs>
+        <w:ind w:left="720" w:hanging="360"/>
+      </w:pPr>
+      <w:rPr>
+        <w:rFonts w:ascii="Symbol" w:hAnsi="Symbol" w:hint="default"/>
+        <w:sz w:val="20"/>
+      </w:rPr>
+    </w:lvl>
+    <w:lvl w:ilvl="1" w:tentative="1">
+      <w:start w:val="1"/>
+      <w:numFmt w:val="bullet"/>
+      <w:lvlText w:val="o"/>
+      <w:lvlJc w:val="left"/>
+      <w:pPr>
+        <w:tabs>
+          <w:tab w:val="num" w:pos="1440"/>
+        </w:tabs>
+        <w:ind w:left="1440" w:hanging="360"/>
+      </w:pPr>
+      <w:rPr>
+        <w:rFonts w:ascii="Courier New" w:hAnsi="Courier New" w:hint="default"/>
+        <w:sz w:val="20"/>
+      </w:rPr>
+    </w:lvl>
+    <w:lvl w:ilvl="2" w:tentative="1">
+      <w:start w:val="1"/>
+      <w:numFmt w:val="bullet"/>
+      <w:lvlText w:val=""/>
+      <w:lvlJc w:val="left"/>
+      <w:pPr>
+        <w:tabs>
+          <w:tab w:val="num" w:pos="2160"/>
+        </w:tabs>
+        <w:ind w:left="2160" w:hanging="360"/>
+      </w:pPr>
+      <w:rPr>
+        <w:rFonts w:ascii="Wingdings" w:hAnsi="Wingdings" w:hint="default"/>
+        <w:sz w:val="20"/>
+      </w:rPr>
+    </w:lvl>
+    <w:lvl w:ilvl="3" w:tentative="1">
+      <w:start w:val="1"/>
+      <w:numFmt w:val="bullet"/>
+      <w:lvlText w:val=""/>
+      <w:lvlJc w:val="left"/>
+      <w:pPr>
+        <w:tabs>
+          <w:tab w:val="num" w:pos="2880"/>
+        </w:tabs>
+        <w:ind w:left="2880" w:hanging="360"/>
+      </w:pPr>
+      <w:rPr>
+        <w:rFonts w:ascii="Wingdings" w:hAnsi="Wingdings" w:hint="default"/>
+        <w:sz w:val="20"/>
+      </w:rPr>
+    </w:lvl>
+    <w:lvl w:ilvl="4" w:tentative="1">
+      <w:start w:val="1"/>
+      <w:numFmt w:val="bullet"/>
+      <w:lvlText w:val=""/>
+      <w:lvlJc w:val="left"/>
+      <w:pPr>
+        <w:tabs>
+          <w:tab w:val="num" w:pos="3600"/>
+        </w:tabs>
+        <w:ind w:left="3600" w:hanging="360"/>
+      </w:pPr>
+      <w:rPr>
+        <w:rFonts w:ascii="Wingdings" w:hAnsi="Wingdings" w:hint="default"/>
+        <w:sz w:val="20"/>
+      </w:rPr>
+    </w:lvl>
+    <w:lvl w:ilvl="5" w:tentative="1">
+      <w:start w:val="1"/>
+      <w:numFmt w:val="bullet"/>
+      <w:lvlText w:val=""/>
+      <w:lvlJc w:val="left"/>
+      <w:pPr>
+        <w:tabs>
+          <w:tab w:val="num" w:pos="4320"/>
+        </w:tabs>
+        <w:ind w:left="4320" w:hanging="360"/>
+      </w:pPr>
+      <w:rPr>
+        <w:rFonts w:ascii="Wingdings" w:hAnsi="Wingdings" w:hint="default"/>
+        <w:sz w:val="20"/>
+      </w:rPr>
+    </w:lvl>
+    <w:lvl w:ilvl="6" w:tentative="1">
+      <w:start w:val="1"/>
+      <w:numFmt w:val="bullet"/>
+      <w:lvlText w:val=""/>
+      <w:lvlJc w:val="left"/>
+      <w:pPr>
+        <w:tabs>
+          <w:tab w:val="num" w:pos="5040"/>
+        </w:tabs>
+        <w:ind w:left="5040" w:hanging="360"/>
+      </w:pPr>
+      <w:rPr>
+        <w:rFonts w:ascii="Wingdings" w:hAnsi="Wingdings" w:hint="default"/>
+        <w:sz w:val="20"/>
+      </w:rPr>
+    </w:lvl>
+    <w:lvl w:ilvl="7" w:tentative="1">
+      <w:start w:val="1"/>
+      <w:numFmt w:val="bullet"/>
+      <w:lvlText w:val=""/>
+      <w:lvlJc w:val="left"/>
+      <w:pPr>
+        <w:tabs>
+          <w:tab w:val="num" w:pos="5760"/>
+        </w:tabs>
+        <w:ind w:left="5760" w:hanging="360"/>
+      </w:pPr>
+      <w:rPr>
+        <w:rFonts w:ascii="Wingdings" w:hAnsi="Wingdings" w:hint="default"/>
+        <w:sz w:val="20"/>
+      </w:rPr>
+    </w:lvl>
+    <w:lvl w:ilvl="8" w:tentative="1">
+      <w:start w:val="1"/>
+      <w:numFmt w:val="bullet"/>
+      <w:lvlText w:val=""/>
+      <w:lvlJc w:val="left"/>
+      <w:pPr>
+        <w:tabs>
+          <w:tab w:val="num" w:pos="6480"/>
+        </w:tabs>
+        <w:ind w:left="6480" w:hanging="360"/>
+      </w:pPr>
+      <w:rPr>
+        <w:rFonts w:ascii="Wingdings" w:hAnsi="Wingdings" w:hint="default"/>
+        <w:sz w:val="20"/>
+      </w:rPr>
+    </w:lvl>
+  </w:abstractNum>
+  <w:num w:numId="1" w16cid:durableId="1086726390">
+    <w:abstractNumId w:val="0"/>
+  </w:num>
+</w:numbering>
+</file>
+
 <file path=word/styles.xml><?xml version="1.0" encoding="utf-8"?>
-<w:styles xmlns:wp14="http://schemas.microsoft.com/office/word/2010/wordprocessingDrawing" xmlns:mc="http://schemas.openxmlformats.org/markup-compatibility/2006" xmlns:r="http://schemas.openxmlformats.org/officeDocument/2006/relationships" xmlns:w="http://schemas.openxmlformats.org/wordprocessingml/2006/main" xmlns:w14="http://schemas.microsoft.com/office/word/2010/wordml" xmlns:w15="http://schemas.microsoft.com/office/word/2012/wordml" xmlns:w16cex="http://schemas.microsoft.com/office/word/2018/wordml/cex" xmlns:w16cid="http://schemas.microsoft.com/office/word/2016/wordml/cid" xmlns:w16="http://schemas.microsoft.com/office/word/2018/wordml" xmlns:w16du="http://schemas.microsoft.com/office/word/2023/wordml/word16du" xmlns:w16sdtdh="http://schemas.microsoft.com/office/word/2020/wordml/sdtdatahash" xmlns:w16sdtfl="http://schemas.microsoft.com/office/word/2024/wordml/sdtformatlock" xmlns:w16se="http://schemas.microsoft.com/office/word/2015/wordml/symex" mc:Ignorable="w14 w15 w16se w16cid w16 w16cex w16sdtdh w16sdtfl w16du wp14">
+<w:styles xmlns:mc="http://schemas.openxmlformats.org/markup-compatibility/2006" xmlns:r="http://schemas.openxmlformats.org/officeDocument/2006/relationships" xmlns:w="http://schemas.openxmlformats.org/wordprocessingml/2006/main" xmlns:w14="http://schemas.microsoft.com/office/word/2010/wordml" xmlns:w15="http://schemas.microsoft.com/office/word/2012/wordml" xmlns:w16cex="http://schemas.microsoft.com/office/word/2018/wordml/cex" xmlns:w16cid="http://schemas.microsoft.com/office/word/2016/wordml/cid" xmlns:w16="http://schemas.microsoft.com/office/word/2018/wordml" xmlns:w16du="http://schemas.microsoft.com/office/word/2023/wordml/word16du" xmlns:w16sdtdh="http://schemas.microsoft.com/office/word/2020/wordml/sdtdatahash" xmlns:w16sdtfl="http://schemas.microsoft.com/office/word/2024/wordml/sdtformatlock" xmlns:w16se="http://schemas.microsoft.com/office/word/2015/wordml/symex" mc:Ignorable="w14 w15 w16se w16cid w16 w16cex w16sdtdh w16sdtfl w16du">
   <w:docDefaults>
     <w:rPrDefault>
       <w:rPr>
-        <w:rFonts w:ascii="Times New Roman" w:hAnsi="Times New Roman" w:eastAsia="Arial Unicode MS" w:cs="Times New Roman"/>
+        <w:rFonts w:ascii="Times New Roman" w:eastAsia="Arial Unicode MS" w:hAnsi="Times New Roman" w:cs="Times New Roman"/>
         <w:bdr w:val="nil"/>
         <w:lang w:val="en-AU" w:eastAsia="en-AU" w:bidi="ar-SA"/>
       </w:rPr>
@@ -3459,14 +3583,14 @@
   <w:latentStyles w:defLockedState="0" w:defUIPriority="99" w:defSemiHidden="0" w:defUnhideWhenUsed="0" w:defQFormat="0" w:count="376">
     <w:lsdException w:name="Normal" w:uiPriority="0" w:qFormat="1"/>
     <w:lsdException w:name="heading 1" w:uiPriority="9" w:qFormat="1"/>
-    <w:lsdException w:name="heading 2" w:uiPriority="9" w:semiHidden="1" w:unhideWhenUsed="1" w:qFormat="1"/>
-    <w:lsdException w:name="heading 3" w:uiPriority="9" w:semiHidden="1" w:unhideWhenUsed="1" w:qFormat="1"/>
-    <w:lsdException w:name="heading 4" w:uiPriority="9" w:semiHidden="1" w:unhideWhenUsed="1" w:qFormat="1"/>
-    <w:lsdException w:name="heading 5" w:uiPriority="9" w:semiHidden="1" w:unhideWhenUsed="1" w:qFormat="1"/>
-    <w:lsdException w:name="heading 6" w:uiPriority="9" w:semiHidden="1" w:unhideWhenUsed="1" w:qFormat="1"/>
-    <w:lsdException w:name="heading 7" w:uiPriority="9" w:semiHidden="1" w:unhideWhenUsed="1" w:qFormat="1"/>
-    <w:lsdException w:name="heading 8" w:uiPriority="9" w:semiHidden="1" w:unhideWhenUsed="1" w:qFormat="1"/>
-    <w:lsdException w:name="heading 9" w:uiPriority="9" w:semiHidden="1" w:unhideWhenUsed="1" w:qFormat="1"/>
+    <w:lsdException w:name="heading 2" w:semiHidden="1" w:uiPriority="9" w:unhideWhenUsed="1" w:qFormat="1"/>
+    <w:lsdException w:name="heading 3" w:semiHidden="1" w:uiPriority="9" w:unhideWhenUsed="1" w:qFormat="1"/>
+    <w:lsdException w:name="heading 4" w:semiHidden="1" w:uiPriority="9" w:unhideWhenUsed="1" w:qFormat="1"/>
+    <w:lsdException w:name="heading 5" w:semiHidden="1" w:uiPriority="9" w:unhideWhenUsed="1" w:qFormat="1"/>
+    <w:lsdException w:name="heading 6" w:semiHidden="1" w:uiPriority="9" w:unhideWhenUsed="1" w:qFormat="1"/>
+    <w:lsdException w:name="heading 7" w:semiHidden="1" w:uiPriority="9" w:unhideWhenUsed="1" w:qFormat="1"/>
+    <w:lsdException w:name="heading 8" w:semiHidden="1" w:uiPriority="9" w:unhideWhenUsed="1" w:qFormat="1"/>
+    <w:lsdException w:name="heading 9" w:semiHidden="1" w:uiPriority="9" w:unhideWhenUsed="1" w:qFormat="1"/>
     <w:lsdException w:name="index 1" w:semiHidden="1" w:unhideWhenUsed="1"/>
     <w:lsdException w:name="index 2" w:semiHidden="1" w:unhideWhenUsed="1"/>
     <w:lsdException w:name="index 3" w:semiHidden="1" w:unhideWhenUsed="1"/>
@@ -3476,22 +3600,22 @@
     <w:lsdException w:name="index 7" w:semiHidden="1" w:unhideWhenUsed="1"/>
     <w:lsdException w:name="index 8" w:semiHidden="1" w:unhideWhenUsed="1"/>
     <w:lsdException w:name="index 9" w:semiHidden="1" w:unhideWhenUsed="1"/>
-    <w:lsdException w:name="toc 1" w:uiPriority="39" w:semiHidden="1" w:unhideWhenUsed="1"/>
-    <w:lsdException w:name="toc 2" w:uiPriority="39" w:semiHidden="1" w:unhideWhenUsed="1"/>
-    <w:lsdException w:name="toc 3" w:uiPriority="39" w:semiHidden="1" w:unhideWhenUsed="1"/>
-    <w:lsdException w:name="toc 4" w:uiPriority="39" w:semiHidden="1" w:unhideWhenUsed="1"/>
-    <w:lsdException w:name="toc 5" w:uiPriority="39" w:semiHidden="1" w:unhideWhenUsed="1"/>
-    <w:lsdException w:name="toc 6" w:uiPriority="39" w:semiHidden="1" w:unhideWhenUsed="1"/>
-    <w:lsdException w:name="toc 7" w:uiPriority="39" w:semiHidden="1" w:unhideWhenUsed="1"/>
-    <w:lsdException w:name="toc 8" w:uiPriority="39" w:semiHidden="1" w:unhideWhenUsed="1"/>
-    <w:lsdException w:name="toc 9" w:uiPriority="39" w:semiHidden="1" w:unhideWhenUsed="1"/>
+    <w:lsdException w:name="toc 1" w:semiHidden="1" w:uiPriority="39" w:unhideWhenUsed="1"/>
+    <w:lsdException w:name="toc 2" w:semiHidden="1" w:uiPriority="39" w:unhideWhenUsed="1"/>
+    <w:lsdException w:name="toc 3" w:semiHidden="1" w:uiPriority="39" w:unhideWhenUsed="1"/>
+    <w:lsdException w:name="toc 4" w:semiHidden="1" w:uiPriority="39" w:unhideWhenUsed="1"/>
+    <w:lsdException w:name="toc 5" w:semiHidden="1" w:uiPriority="39" w:unhideWhenUsed="1"/>
+    <w:lsdException w:name="toc 6" w:semiHidden="1" w:uiPriority="39" w:unhideWhenUsed="1"/>
+    <w:lsdException w:name="toc 7" w:semiHidden="1" w:uiPriority="39" w:unhideWhenUsed="1"/>
+    <w:lsdException w:name="toc 8" w:semiHidden="1" w:uiPriority="39" w:unhideWhenUsed="1"/>
+    <w:lsdException w:name="toc 9" w:semiHidden="1" w:uiPriority="39" w:unhideWhenUsed="1"/>
     <w:lsdException w:name="Normal Indent" w:semiHidden="1" w:unhideWhenUsed="1"/>
     <w:lsdException w:name="footnote text" w:semiHidden="1" w:unhideWhenUsed="1"/>
     <w:lsdException w:name="annotation text" w:semiHidden="1" w:unhideWhenUsed="1"/>
     <w:lsdException w:name="header" w:semiHidden="1" w:unhideWhenUsed="1"/>
     <w:lsdException w:name="footer" w:semiHidden="1" w:unhideWhenUsed="1"/>
     <w:lsdException w:name="index heading" w:semiHidden="1" w:unhideWhenUsed="1"/>
-    <w:lsdException w:name="caption" w:uiPriority="35" w:semiHidden="1" w:unhideWhenUsed="1" w:qFormat="1"/>
+    <w:lsdException w:name="caption" w:semiHidden="1" w:uiPriority="35" w:unhideWhenUsed="1" w:qFormat="1"/>
     <w:lsdException w:name="table of figures" w:semiHidden="1" w:unhideWhenUsed="1"/>
     <w:lsdException w:name="envelope address" w:semiHidden="1" w:unhideWhenUsed="1"/>
     <w:lsdException w:name="envelope return" w:semiHidden="1" w:unhideWhenUsed="1"/>
@@ -3522,7 +3646,7 @@
     <w:lsdException w:name="Title" w:uiPriority="10" w:qFormat="1"/>
     <w:lsdException w:name="Closing" w:semiHidden="1" w:unhideWhenUsed="1"/>
     <w:lsdException w:name="Signature" w:semiHidden="1" w:unhideWhenUsed="1"/>
-    <w:lsdException w:name="Default Paragraph Font" w:uiPriority="1" w:semiHidden="1" w:unhideWhenUsed="1"/>
+    <w:lsdException w:name="Default Paragraph Font" w:semiHidden="1" w:uiPriority="1" w:unhideWhenUsed="1"/>
     <w:lsdException w:name="Body Text" w:semiHidden="1" w:unhideWhenUsed="1"/>
     <w:lsdException w:name="Body Text Indent" w:semiHidden="1" w:unhideWhenUsed="1"/>
     <w:lsdException w:name="List Continue" w:semiHidden="1" w:unhideWhenUsed="1"/>
@@ -3722,8 +3846,8 @@
     <w:lsdException w:name="Subtle Reference" w:uiPriority="31" w:qFormat="1"/>
     <w:lsdException w:name="Intense Reference" w:uiPriority="32" w:qFormat="1"/>
     <w:lsdException w:name="Book Title" w:uiPriority="33" w:qFormat="1"/>
-    <w:lsdException w:name="Bibliography" w:uiPriority="37" w:semiHidden="1" w:unhideWhenUsed="1"/>
-    <w:lsdException w:name="TOC Heading" w:uiPriority="39" w:semiHidden="1" w:unhideWhenUsed="1" w:qFormat="1"/>
+    <w:lsdException w:name="Bibliography" w:semiHidden="1" w:uiPriority="37" w:unhideWhenUsed="1"/>
+    <w:lsdException w:name="TOC Heading" w:semiHidden="1" w:uiPriority="39" w:unhideWhenUsed="1" w:qFormat="1"/>
     <w:lsdException w:name="Plain Table 1" w:uiPriority="41"/>
     <w:lsdException w:name="Plain Table 2" w:uiPriority="42"/>
     <w:lsdException w:name="Plain Table 3" w:uiPriority="43"/>
@@ -3834,7 +3958,7 @@
     <w:lsdException w:name="Unresolved Mention" w:semiHidden="1" w:unhideWhenUsed="1"/>
     <w:lsdException w:name="Smart Link" w:semiHidden="1" w:unhideWhenUsed="1"/>
   </w:latentStyles>
-  <w:style w:type="paragraph" w:styleId="Normal" w:default="1">
+  <w:style w:type="paragraph" w:default="1" w:styleId="Normal">
     <w:name w:val="Normal"/>
     <w:qFormat/>
     <w:rPr>
@@ -3871,12 +3995,12 @@
       </w14:textOutline>
     </w:rPr>
   </w:style>
-  <w:style w:type="character" w:styleId="DefaultParagraphFont" w:default="1">
+  <w:style w:type="character" w:default="1" w:styleId="DefaultParagraphFont">
     <w:name w:val="Default Paragraph Font"/>
     <w:uiPriority w:val="1"/>
     <w:unhideWhenUsed/>
   </w:style>
-  <w:style w:type="table" w:styleId="TableNormal" w:default="1">
+  <w:style w:type="table" w:default="1" w:styleId="TableNormal">
     <w:name w:val="Normal Table"/>
     <w:uiPriority w:val="99"/>
     <w:semiHidden/>
@@ -3891,7 +4015,7 @@
       </w:tblCellMar>
     </w:tblPr>
   </w:style>
-  <w:style w:type="numbering" w:styleId="NoList" w:default="1">
+  <w:style w:type="numbering" w:default="1" w:styleId="NoList">
     <w:name w:val="No List"/>
     <w:uiPriority w:val="99"/>
     <w:semiHidden/>
@@ -3903,7 +4027,7 @@
       <w:u w:val="single"/>
     </w:rPr>
   </w:style>
-  <w:style w:type="paragraph" w:styleId="HeaderFooter" w:customStyle="1">
+  <w:style w:type="paragraph" w:customStyle="1" w:styleId="HeaderFooter">
     <w:name w:val="Header &amp; Footer"/>
     <w:pPr>
       <w:tabs>
@@ -3922,13 +4046,13 @@
       </w14:textOutline>
     </w:rPr>
   </w:style>
-  <w:style w:type="paragraph" w:styleId="BodyA" w:customStyle="1">
+  <w:style w:type="paragraph" w:customStyle="1" w:styleId="BodyA">
     <w:name w:val="Body A"/>
     <w:pPr>
       <w:spacing w:after="200" w:line="276" w:lineRule="auto"/>
     </w:pPr>
     <w:rPr>
-      <w:rFonts w:ascii="Aptos" w:hAnsi="Aptos" w:eastAsia="Aptos" w:cs="Aptos"/>
+      <w:rFonts w:ascii="Aptos" w:eastAsia="Aptos" w:hAnsi="Aptos" w:cs="Aptos"/>
       <w:color w:val="000000"/>
       <w:sz w:val="18"/>
       <w:szCs w:val="18"/>
@@ -3940,10 +4064,10 @@
       </w14:textOutline>
     </w:rPr>
   </w:style>
-  <w:style w:type="character" w:styleId="None" w:customStyle="1">
+  <w:style w:type="character" w:customStyle="1" w:styleId="None">
     <w:name w:val="None"/>
   </w:style>
-  <w:style w:type="character" w:styleId="Hyperlink0" w:customStyle="1">
+  <w:style w:type="character" w:customStyle="1" w:styleId="Hyperlink0">
     <w:name w:val="Hyperlink.0"/>
     <w:basedOn w:val="None"/>
     <w:rPr>
@@ -3953,7 +4077,7 @@
       <w:lang w:val="de-DE"/>
     </w:rPr>
   </w:style>
-  <w:style w:type="paragraph" w:styleId="Heading" w:customStyle="1">
+  <w:style w:type="paragraph" w:customStyle="1" w:styleId="Heading">
     <w:name w:val="Heading"/>
     <w:next w:val="BodyA"/>
     <w:pPr>
@@ -3978,7 +4102,7 @@
       </w14:textOutline>
     </w:rPr>
   </w:style>
-  <w:style w:type="character" w:styleId="Hyperlink1" w:customStyle="1">
+  <w:style w:type="character" w:customStyle="1" w:styleId="Hyperlink1">
     <w:name w:val="Hyperlink.1"/>
     <w:basedOn w:val="None"/>
     <w:rPr>
@@ -3988,7 +4112,7 @@
       <w:lang w:val="en-US"/>
     </w:rPr>
   </w:style>
-  <w:style w:type="paragraph" w:styleId="Body" w:customStyle="1">
+  <w:style w:type="paragraph" w:customStyle="1" w:styleId="Body">
     <w:name w:val="Body"/>
     <w:rPr>
       <w:rFonts w:cs="Arial Unicode MS"/>
@@ -4015,6 +4139,14 @@
       <w:color w:val="605E5C"/>
       <w:shd w:val="clear" w:color="auto" w:fill="E1DFDD"/>
     </w:rPr>
+  </w:style>
+  <w:style w:type="paragraph" w:styleId="NormalWeb">
+    <w:name w:val="Normal (Web)"/>
+    <w:basedOn w:val="Normal"/>
+    <w:uiPriority w:val="99"/>
+    <w:semiHidden/>
+    <w:unhideWhenUsed/>
+    <w:rsid w:val="00231BF3"/>
   </w:style>
 </w:styles>
 </file>

</xml_diff>